<commit_message>
fix: fix paper v3
</commit_message>
<xml_diff>
--- a/docs/專題報告書_v3.docx
+++ b/docs/專題報告書_v3.docx
@@ -160,7 +160,7 @@
         <w:t>標註方式。</w:t>
       </w:r>
       <w:r>
-        <w:t xml:space="preserve"> 正確答案改為由三位組員逐題討論 200 題後的 labels_oir_total.csv，取代 v2 中由研究者一人修正的版本（4.1.3 節）。</w:t>
+        <w:t xml:space="preserve"> 正確答案改為由三位組員逐題討論 200 題後的 labels_oir_total_ori.csv，取代 v2 中由研究者一人修正的版本（4.1.3 節）。</w:t>
       </w:r>
     </w:p>
     <w:p>
@@ -181,7 +181,7 @@
         <w:t>標註規則第 2 版。</w:t>
       </w:r>
       <w:r>
-        <w:t xml:space="preserve"> 新增學期別（秋季與春季、第一與第二學期）、招募、無名單之結果、階段、同類獎勵等規則，並訂定規則衝突時的優先順序；依新規則修正 18 題（3.1 節、4.1.3 節、附錄 A）。</w:t>
+        <w:t xml:space="preserve"> 依三位組員的討論結果整理規則：徵才與所有結果公告屬 NEW；每學期重複舉辦的志工招募、第二次甄選與同一甄選的下一階段屬 UPDATE；被取代公告優先選擇同一學期別的版本（3.1 節、4.1.3 節、附錄 A）。</w:t>
       </w:r>
     </w:p>
     <w:p>
@@ -202,7 +202,7 @@
         <w:t>類別分布與資料分割。</w:t>
       </w:r>
       <w:r>
-        <w:t xml:space="preserve"> 改為 UPDATE 115、NEW 80、REDUNDANT 5；測試集 120 題中 38 題為真實附件（表 4.2）。</w:t>
+        <w:t xml:space="preserve"> 改為 UPDATE 129、NEW 66、REDUNDANT 5；測試集 120 題中 37 題為真實附件（表 4.2）。</w:t>
       </w:r>
     </w:p>
     <w:p>
@@ -220,10 +220,10 @@
           <w:b/>
           <w:bCs/>
         </w:rPr>
-        <w:t>移除 v2 的實驗結果。</w:t>
-      </w:r>
-      <w:r>
-        <w:t xml:space="preserve"> v2 第四章的數據（表 4.3 至表 4.6 的數值、圖 4.1 至圖 4.4、錯誤分析與討論）以舊標註計算，已不適用，因此暫時移除，待三個模型皆以新標註執行後補上。第 4.3 節標題由「規則方法與 Qwen3-4B 之結果」改為「規則方法與語言模型之結果」。</w:t>
+        <w:t>系統提示詞。</w:t>
+      </w:r>
+      <w:r>
+        <w:t xml:space="preserve"> 依第 2 版規則改寫，並說明加入完整規則清單的嘗試（3.6.2 節、附錄 C）。</w:t>
       </w:r>
     </w:p>
     <w:p>
@@ -241,10 +241,10 @@
           <w:b/>
           <w:bCs/>
         </w:rPr>
-        <w:t>摘要與第五章。</w:t>
-      </w:r>
-      <w:r>
-        <w:t xml:space="preserve"> 依上述修改改寫結果相關的段落。</w:t>
+        <w:t>移除 v2 的實驗結果。</w:t>
+      </w:r>
+      <w:r>
+        <w:t xml:space="preserve"> v2 第四章的數據（表 4.3 至表 4.6 的數值、圖 4.1 至圖 4.4、錯誤分析與討論）以舊標註計算，已不適用，因此暫時移除，待三個模型皆以新標註執行後補上。第 4.3 節標題由「規則方法與 Qwen3-4B 之結果」改為「規則方法與語言模型之結果」。</w:t>
       </w:r>
     </w:p>
     <w:p>
@@ -262,10 +262,10 @@
           <w:b/>
           <w:bCs/>
         </w:rPr>
-        <w:t>回應時間的量測。</w:t>
-      </w:r>
-      <w:r>
-        <w:t xml:space="preserve"> 新增說明：三個模型由不同組員執行時，回應時間須於同一設備上量測才能比較（3.6.2 節）。</w:t>
+        <w:t>摘要與第五章。</w:t>
+      </w:r>
+      <w:r>
+        <w:t xml:space="preserve"> 依上述修改改寫結果相關的段落。</w:t>
       </w:r>
     </w:p>
     <w:p>
@@ -283,10 +283,31 @@
           <w:b/>
           <w:bCs/>
         </w:rPr>
+        <w:t>回應時間的量測。</w:t>
+      </w:r>
+      <w:r>
+        <w:t xml:space="preserve"> 新增說明：三個模型由不同組員執行時，回應時間須於同一設備上量測才能比較（3.6.2 節）。</w:t>
+      </w:r>
+    </w:p>
+    <w:p>
+      <w:pPr>
+        <w:pStyle w:val="19"/>
+        <w:numPr>
+          <w:ilvl w:val="0"/>
+          <w:numId w:val="1"/>
+        </w:numPr>
+        <w:spacing w:before="0" w:after="0" w:line="360" w:lineRule="auto"/>
+        <w:jc w:val="both"/>
+      </w:pPr>
+      <w:r>
+        <w:rPr>
+          <w:b/>
+          <w:bCs/>
+        </w:rPr>
         <w:t>附錄 B。</w:t>
       </w:r>
       <w:r>
-        <w:t xml:space="preserve"> 實驗指令改用 labels_oir_total.csv。</w:t>
+        <w:t xml:space="preserve"> 實驗指令改用 labels_oir_total_ori.csv。</w:t>
       </w:r>
     </w:p>
     <w:p>
@@ -294,7 +315,7 @@
         <w:pStyle w:val="22"/>
         <w:pageBreakBefore/>
       </w:pPr>
-      <w:bookmarkStart w:id="0" w:name="_Toc2087"/>
+      <w:bookmarkStart w:id="0" w:name="_Toc17023"/>
       <w:r>
         <w:t>誌謝</w:t>
       </w:r>
@@ -335,7 +356,7 @@
         <w:pStyle w:val="22"/>
         <w:pageBreakBefore/>
       </w:pPr>
-      <w:bookmarkStart w:id="1" w:name="_Toc14997"/>
+      <w:bookmarkStart w:id="1" w:name="_Toc2729"/>
       <w:r>
         <w:t>摘要</w:t>
       </w:r>
@@ -391,7 +412,7 @@
           <w:bCs/>
           <w:color w:val="1F4E9A"/>
         </w:rPr>
-        <w:t>標註規則已依討論結果修訂為第 2 版，正確答案亦隨之更新，因此三個模型的實驗皆以新的正確答案重新執行，結果待補。</w:t>
+        <w:t>標註規則已依三位組員的討論結果整理為第 2 版，正確答案亦隨之更新，因此三個模型的實驗皆以新的正確答案重新執行，結果待補。</w:t>
       </w:r>
     </w:p>
     <w:p>
@@ -431,7 +452,7 @@
     <w:sdt>
       <w:sdtPr>
         <w:alias w:val="目錄"/>
-        <w:id w:val="147464281"/>
+        <w:id w:val="147456201"/>
       </w:sdtPr>
       <w:sdtContent>
         <w:p>
@@ -466,7 +487,7 @@
             <w:fldChar w:fldCharType="begin"/>
           </w:r>
           <w:r>
-            <w:instrText xml:space="preserve"> HYPERLINK \l _Toc2087 </w:instrText>
+            <w:instrText xml:space="preserve"> HYPERLINK \l _Toc17023 </w:instrText>
           </w:r>
           <w:r>
             <w:fldChar w:fldCharType="separate"/>
@@ -481,7 +502,7 @@
             <w:fldChar w:fldCharType="begin"/>
           </w:r>
           <w:r>
-            <w:instrText xml:space="preserve"> PAGEREF _Toc2087 \h </w:instrText>
+            <w:instrText xml:space="preserve"> PAGEREF _Toc17023 \h </w:instrText>
           </w:r>
           <w:r>
             <w:fldChar w:fldCharType="separate"/>
@@ -507,7 +528,7 @@
             <w:fldChar w:fldCharType="begin"/>
           </w:r>
           <w:r>
-            <w:instrText xml:space="preserve"> HYPERLINK \l _Toc14997 </w:instrText>
+            <w:instrText xml:space="preserve"> HYPERLINK \l _Toc2729 </w:instrText>
           </w:r>
           <w:r>
             <w:fldChar w:fldCharType="separate"/>
@@ -522,7 +543,7 @@
             <w:fldChar w:fldCharType="begin"/>
           </w:r>
           <w:r>
-            <w:instrText xml:space="preserve"> PAGEREF _Toc14997 \h </w:instrText>
+            <w:instrText xml:space="preserve"> PAGEREF _Toc2729 \h </w:instrText>
           </w:r>
           <w:r>
             <w:fldChar w:fldCharType="separate"/>
@@ -548,7 +569,7 @@
             <w:fldChar w:fldCharType="begin"/>
           </w:r>
           <w:r>
-            <w:instrText xml:space="preserve"> HYPERLINK \l _Toc17657 </w:instrText>
+            <w:instrText xml:space="preserve"> HYPERLINK \l _Toc15610 </w:instrText>
           </w:r>
           <w:r>
             <w:fldChar w:fldCharType="separate"/>
@@ -563,7 +584,7 @@
             <w:fldChar w:fldCharType="begin"/>
           </w:r>
           <w:r>
-            <w:instrText xml:space="preserve"> PAGEREF _Toc17657 \h </w:instrText>
+            <w:instrText xml:space="preserve"> PAGEREF _Toc15610 \h </w:instrText>
           </w:r>
           <w:r>
             <w:fldChar w:fldCharType="separate"/>
@@ -589,7 +610,7 @@
             <w:fldChar w:fldCharType="begin"/>
           </w:r>
           <w:r>
-            <w:instrText xml:space="preserve"> HYPERLINK \l _Toc12208 </w:instrText>
+            <w:instrText xml:space="preserve"> HYPERLINK \l _Toc7755 </w:instrText>
           </w:r>
           <w:r>
             <w:fldChar w:fldCharType="separate"/>
@@ -604,7 +625,7 @@
             <w:fldChar w:fldCharType="begin"/>
           </w:r>
           <w:r>
-            <w:instrText xml:space="preserve"> PAGEREF _Toc12208 \h </w:instrText>
+            <w:instrText xml:space="preserve"> PAGEREF _Toc7755 \h </w:instrText>
           </w:r>
           <w:r>
             <w:fldChar w:fldCharType="separate"/>
@@ -630,7 +651,7 @@
             <w:fldChar w:fldCharType="begin"/>
           </w:r>
           <w:r>
-            <w:instrText xml:space="preserve"> HYPERLINK \l _Toc17683 </w:instrText>
+            <w:instrText xml:space="preserve"> HYPERLINK \l _Toc1915 </w:instrText>
           </w:r>
           <w:r>
             <w:fldChar w:fldCharType="separate"/>
@@ -645,7 +666,7 @@
             <w:fldChar w:fldCharType="begin"/>
           </w:r>
           <w:r>
-            <w:instrText xml:space="preserve"> PAGEREF _Toc17683 \h </w:instrText>
+            <w:instrText xml:space="preserve"> PAGEREF _Toc1915 \h </w:instrText>
           </w:r>
           <w:r>
             <w:fldChar w:fldCharType="separate"/>
@@ -671,7 +692,7 @@
             <w:fldChar w:fldCharType="begin"/>
           </w:r>
           <w:r>
-            <w:instrText xml:space="preserve"> HYPERLINK \l _Toc27333 </w:instrText>
+            <w:instrText xml:space="preserve"> HYPERLINK \l _Toc692 </w:instrText>
           </w:r>
           <w:r>
             <w:fldChar w:fldCharType="separate"/>
@@ -686,7 +707,7 @@
             <w:fldChar w:fldCharType="begin"/>
           </w:r>
           <w:r>
-            <w:instrText xml:space="preserve"> PAGEREF _Toc27333 \h </w:instrText>
+            <w:instrText xml:space="preserve"> PAGEREF _Toc692 \h </w:instrText>
           </w:r>
           <w:r>
             <w:fldChar w:fldCharType="separate"/>
@@ -712,7 +733,7 @@
             <w:fldChar w:fldCharType="begin"/>
           </w:r>
           <w:r>
-            <w:instrText xml:space="preserve"> HYPERLINK \l _Toc21708 </w:instrText>
+            <w:instrText xml:space="preserve"> HYPERLINK \l _Toc4634 </w:instrText>
           </w:r>
           <w:r>
             <w:fldChar w:fldCharType="separate"/>
@@ -727,7 +748,7 @@
             <w:fldChar w:fldCharType="begin"/>
           </w:r>
           <w:r>
-            <w:instrText xml:space="preserve"> PAGEREF _Toc21708 \h </w:instrText>
+            <w:instrText xml:space="preserve"> PAGEREF _Toc4634 \h </w:instrText>
           </w:r>
           <w:r>
             <w:fldChar w:fldCharType="separate"/>
@@ -753,7 +774,7 @@
             <w:fldChar w:fldCharType="begin"/>
           </w:r>
           <w:r>
-            <w:instrText xml:space="preserve"> HYPERLINK \l _Toc8015 </w:instrText>
+            <w:instrText xml:space="preserve"> HYPERLINK \l _Toc12392 </w:instrText>
           </w:r>
           <w:r>
             <w:fldChar w:fldCharType="separate"/>
@@ -768,7 +789,7 @@
             <w:fldChar w:fldCharType="begin"/>
           </w:r>
           <w:r>
-            <w:instrText xml:space="preserve"> PAGEREF _Toc8015 \h </w:instrText>
+            <w:instrText xml:space="preserve"> PAGEREF _Toc12392 \h </w:instrText>
           </w:r>
           <w:r>
             <w:fldChar w:fldCharType="separate"/>
@@ -794,7 +815,7 @@
             <w:fldChar w:fldCharType="begin"/>
           </w:r>
           <w:r>
-            <w:instrText xml:space="preserve"> HYPERLINK \l _Toc6195 </w:instrText>
+            <w:instrText xml:space="preserve"> HYPERLINK \l _Toc16623 </w:instrText>
           </w:r>
           <w:r>
             <w:fldChar w:fldCharType="separate"/>
@@ -809,7 +830,7 @@
             <w:fldChar w:fldCharType="begin"/>
           </w:r>
           <w:r>
-            <w:instrText xml:space="preserve"> PAGEREF _Toc6195 \h </w:instrText>
+            <w:instrText xml:space="preserve"> PAGEREF _Toc16623 \h </w:instrText>
           </w:r>
           <w:r>
             <w:fldChar w:fldCharType="separate"/>
@@ -835,7 +856,7 @@
             <w:fldChar w:fldCharType="begin"/>
           </w:r>
           <w:r>
-            <w:instrText xml:space="preserve"> HYPERLINK \l _Toc3508 </w:instrText>
+            <w:instrText xml:space="preserve"> HYPERLINK \l _Toc6710 </w:instrText>
           </w:r>
           <w:r>
             <w:fldChar w:fldCharType="separate"/>
@@ -850,7 +871,7 @@
             <w:fldChar w:fldCharType="begin"/>
           </w:r>
           <w:r>
-            <w:instrText xml:space="preserve"> PAGEREF _Toc3508 \h </w:instrText>
+            <w:instrText xml:space="preserve"> PAGEREF _Toc6710 \h </w:instrText>
           </w:r>
           <w:r>
             <w:fldChar w:fldCharType="separate"/>
@@ -876,7 +897,7 @@
             <w:fldChar w:fldCharType="begin"/>
           </w:r>
           <w:r>
-            <w:instrText xml:space="preserve"> HYPERLINK \l _Toc4184 </w:instrText>
+            <w:instrText xml:space="preserve"> HYPERLINK \l _Toc17984 </w:instrText>
           </w:r>
           <w:r>
             <w:fldChar w:fldCharType="separate"/>
@@ -891,7 +912,7 @@
             <w:fldChar w:fldCharType="begin"/>
           </w:r>
           <w:r>
-            <w:instrText xml:space="preserve"> PAGEREF _Toc4184 \h </w:instrText>
+            <w:instrText xml:space="preserve"> PAGEREF _Toc17984 \h </w:instrText>
           </w:r>
           <w:r>
             <w:fldChar w:fldCharType="separate"/>
@@ -917,7 +938,7 @@
             <w:fldChar w:fldCharType="begin"/>
           </w:r>
           <w:r>
-            <w:instrText xml:space="preserve"> HYPERLINK \l _Toc5090 </w:instrText>
+            <w:instrText xml:space="preserve"> HYPERLINK \l _Toc20792 </w:instrText>
           </w:r>
           <w:r>
             <w:fldChar w:fldCharType="separate"/>
@@ -932,7 +953,7 @@
             <w:fldChar w:fldCharType="begin"/>
           </w:r>
           <w:r>
-            <w:instrText xml:space="preserve"> PAGEREF _Toc5090 \h </w:instrText>
+            <w:instrText xml:space="preserve"> PAGEREF _Toc20792 \h </w:instrText>
           </w:r>
           <w:r>
             <w:fldChar w:fldCharType="separate"/>
@@ -958,7 +979,7 @@
             <w:fldChar w:fldCharType="begin"/>
           </w:r>
           <w:r>
-            <w:instrText xml:space="preserve"> HYPERLINK \l _Toc2066 </w:instrText>
+            <w:instrText xml:space="preserve"> HYPERLINK \l _Toc7932 </w:instrText>
           </w:r>
           <w:r>
             <w:fldChar w:fldCharType="separate"/>
@@ -973,7 +994,7 @@
             <w:fldChar w:fldCharType="begin"/>
           </w:r>
           <w:r>
-            <w:instrText xml:space="preserve"> PAGEREF _Toc2066 \h </w:instrText>
+            <w:instrText xml:space="preserve"> PAGEREF _Toc7932 \h </w:instrText>
           </w:r>
           <w:r>
             <w:fldChar w:fldCharType="separate"/>
@@ -999,7 +1020,7 @@
             <w:fldChar w:fldCharType="begin"/>
           </w:r>
           <w:r>
-            <w:instrText xml:space="preserve"> HYPERLINK \l _Toc2955 </w:instrText>
+            <w:instrText xml:space="preserve"> HYPERLINK \l _Toc21975 </w:instrText>
           </w:r>
           <w:r>
             <w:fldChar w:fldCharType="separate"/>
@@ -1014,7 +1035,7 @@
             <w:fldChar w:fldCharType="begin"/>
           </w:r>
           <w:r>
-            <w:instrText xml:space="preserve"> PAGEREF _Toc2955 \h </w:instrText>
+            <w:instrText xml:space="preserve"> PAGEREF _Toc21975 \h </w:instrText>
           </w:r>
           <w:r>
             <w:fldChar w:fldCharType="separate"/>
@@ -1040,7 +1061,7 @@
             <w:fldChar w:fldCharType="begin"/>
           </w:r>
           <w:r>
-            <w:instrText xml:space="preserve"> HYPERLINK \l _Toc2993 </w:instrText>
+            <w:instrText xml:space="preserve"> HYPERLINK \l _Toc19518 </w:instrText>
           </w:r>
           <w:r>
             <w:fldChar w:fldCharType="separate"/>
@@ -1055,7 +1076,7 @@
             <w:fldChar w:fldCharType="begin"/>
           </w:r>
           <w:r>
-            <w:instrText xml:space="preserve"> PAGEREF _Toc2993 \h </w:instrText>
+            <w:instrText xml:space="preserve"> PAGEREF _Toc19518 \h </w:instrText>
           </w:r>
           <w:r>
             <w:fldChar w:fldCharType="separate"/>
@@ -1081,7 +1102,7 @@
             <w:fldChar w:fldCharType="begin"/>
           </w:r>
           <w:r>
-            <w:instrText xml:space="preserve"> HYPERLINK \l _Toc11138 </w:instrText>
+            <w:instrText xml:space="preserve"> HYPERLINK \l _Toc26068 </w:instrText>
           </w:r>
           <w:r>
             <w:fldChar w:fldCharType="separate"/>
@@ -1096,7 +1117,7 @@
             <w:fldChar w:fldCharType="begin"/>
           </w:r>
           <w:r>
-            <w:instrText xml:space="preserve"> PAGEREF _Toc11138 \h </w:instrText>
+            <w:instrText xml:space="preserve"> PAGEREF _Toc26068 \h </w:instrText>
           </w:r>
           <w:r>
             <w:fldChar w:fldCharType="separate"/>
@@ -1122,7 +1143,7 @@
             <w:fldChar w:fldCharType="begin"/>
           </w:r>
           <w:r>
-            <w:instrText xml:space="preserve"> HYPERLINK \l _Toc27511 </w:instrText>
+            <w:instrText xml:space="preserve"> HYPERLINK \l _Toc31142 </w:instrText>
           </w:r>
           <w:r>
             <w:fldChar w:fldCharType="separate"/>
@@ -1137,7 +1158,7 @@
             <w:fldChar w:fldCharType="begin"/>
           </w:r>
           <w:r>
-            <w:instrText xml:space="preserve"> PAGEREF _Toc27511 \h </w:instrText>
+            <w:instrText xml:space="preserve"> PAGEREF _Toc31142 \h </w:instrText>
           </w:r>
           <w:r>
             <w:fldChar w:fldCharType="separate"/>
@@ -1163,7 +1184,7 @@
             <w:fldChar w:fldCharType="begin"/>
           </w:r>
           <w:r>
-            <w:instrText xml:space="preserve"> HYPERLINK \l _Toc3275 </w:instrText>
+            <w:instrText xml:space="preserve"> HYPERLINK \l _Toc22432 </w:instrText>
           </w:r>
           <w:r>
             <w:fldChar w:fldCharType="separate"/>
@@ -1178,7 +1199,7 @@
             <w:fldChar w:fldCharType="begin"/>
           </w:r>
           <w:r>
-            <w:instrText xml:space="preserve"> PAGEREF _Toc3275 \h </w:instrText>
+            <w:instrText xml:space="preserve"> PAGEREF _Toc22432 \h </w:instrText>
           </w:r>
           <w:r>
             <w:fldChar w:fldCharType="separate"/>
@@ -1204,7 +1225,7 @@
             <w:fldChar w:fldCharType="begin"/>
           </w:r>
           <w:r>
-            <w:instrText xml:space="preserve"> HYPERLINK \l _Toc1761 </w:instrText>
+            <w:instrText xml:space="preserve"> HYPERLINK \l _Toc32721 </w:instrText>
           </w:r>
           <w:r>
             <w:fldChar w:fldCharType="separate"/>
@@ -1219,7 +1240,7 @@
             <w:fldChar w:fldCharType="begin"/>
           </w:r>
           <w:r>
-            <w:instrText xml:space="preserve"> PAGEREF _Toc1761 \h </w:instrText>
+            <w:instrText xml:space="preserve"> PAGEREF _Toc32721 \h </w:instrText>
           </w:r>
           <w:r>
             <w:fldChar w:fldCharType="separate"/>
@@ -1245,7 +1266,7 @@
             <w:fldChar w:fldCharType="begin"/>
           </w:r>
           <w:r>
-            <w:instrText xml:space="preserve"> HYPERLINK \l _Toc14682 </w:instrText>
+            <w:instrText xml:space="preserve"> HYPERLINK \l _Toc21908 </w:instrText>
           </w:r>
           <w:r>
             <w:fldChar w:fldCharType="separate"/>
@@ -1260,7 +1281,7 @@
             <w:fldChar w:fldCharType="begin"/>
           </w:r>
           <w:r>
-            <w:instrText xml:space="preserve"> PAGEREF _Toc14682 \h </w:instrText>
+            <w:instrText xml:space="preserve"> PAGEREF _Toc21908 \h </w:instrText>
           </w:r>
           <w:r>
             <w:fldChar w:fldCharType="separate"/>
@@ -1286,7 +1307,7 @@
             <w:fldChar w:fldCharType="begin"/>
           </w:r>
           <w:r>
-            <w:instrText xml:space="preserve"> HYPERLINK \l _Toc20211 </w:instrText>
+            <w:instrText xml:space="preserve"> HYPERLINK \l _Toc27446 </w:instrText>
           </w:r>
           <w:r>
             <w:fldChar w:fldCharType="separate"/>
@@ -1301,7 +1322,7 @@
             <w:fldChar w:fldCharType="begin"/>
           </w:r>
           <w:r>
-            <w:instrText xml:space="preserve"> PAGEREF _Toc20211 \h </w:instrText>
+            <w:instrText xml:space="preserve"> PAGEREF _Toc27446 \h </w:instrText>
           </w:r>
           <w:r>
             <w:fldChar w:fldCharType="separate"/>
@@ -1327,7 +1348,7 @@
             <w:fldChar w:fldCharType="begin"/>
           </w:r>
           <w:r>
-            <w:instrText xml:space="preserve"> HYPERLINK \l _Toc6546 </w:instrText>
+            <w:instrText xml:space="preserve"> HYPERLINK \l _Toc8133 </w:instrText>
           </w:r>
           <w:r>
             <w:fldChar w:fldCharType="separate"/>
@@ -1342,7 +1363,7 @@
             <w:fldChar w:fldCharType="begin"/>
           </w:r>
           <w:r>
-            <w:instrText xml:space="preserve"> PAGEREF _Toc6546 \h </w:instrText>
+            <w:instrText xml:space="preserve"> PAGEREF _Toc8133 \h </w:instrText>
           </w:r>
           <w:r>
             <w:fldChar w:fldCharType="separate"/>
@@ -1368,7 +1389,7 @@
             <w:fldChar w:fldCharType="begin"/>
           </w:r>
           <w:r>
-            <w:instrText xml:space="preserve"> HYPERLINK \l _Toc8229 </w:instrText>
+            <w:instrText xml:space="preserve"> HYPERLINK \l _Toc13095 </w:instrText>
           </w:r>
           <w:r>
             <w:fldChar w:fldCharType="separate"/>
@@ -1383,7 +1404,7 @@
             <w:fldChar w:fldCharType="begin"/>
           </w:r>
           <w:r>
-            <w:instrText xml:space="preserve"> PAGEREF _Toc8229 \h </w:instrText>
+            <w:instrText xml:space="preserve"> PAGEREF _Toc13095 \h </w:instrText>
           </w:r>
           <w:r>
             <w:fldChar w:fldCharType="separate"/>
@@ -1409,7 +1430,7 @@
             <w:fldChar w:fldCharType="begin"/>
           </w:r>
           <w:r>
-            <w:instrText xml:space="preserve"> HYPERLINK \l _Toc32520 </w:instrText>
+            <w:instrText xml:space="preserve"> HYPERLINK \l _Toc29057 </w:instrText>
           </w:r>
           <w:r>
             <w:fldChar w:fldCharType="separate"/>
@@ -1424,7 +1445,7 @@
             <w:fldChar w:fldCharType="begin"/>
           </w:r>
           <w:r>
-            <w:instrText xml:space="preserve"> PAGEREF _Toc32520 \h </w:instrText>
+            <w:instrText xml:space="preserve"> PAGEREF _Toc29057 \h </w:instrText>
           </w:r>
           <w:r>
             <w:fldChar w:fldCharType="separate"/>
@@ -1450,7 +1471,7 @@
             <w:fldChar w:fldCharType="begin"/>
           </w:r>
           <w:r>
-            <w:instrText xml:space="preserve"> HYPERLINK \l _Toc22710 </w:instrText>
+            <w:instrText xml:space="preserve"> HYPERLINK \l _Toc27100 </w:instrText>
           </w:r>
           <w:r>
             <w:fldChar w:fldCharType="separate"/>
@@ -1465,7 +1486,7 @@
             <w:fldChar w:fldCharType="begin"/>
           </w:r>
           <w:r>
-            <w:instrText xml:space="preserve"> PAGEREF _Toc22710 \h </w:instrText>
+            <w:instrText xml:space="preserve"> PAGEREF _Toc27100 \h </w:instrText>
           </w:r>
           <w:r>
             <w:fldChar w:fldCharType="separate"/>
@@ -1491,7 +1512,7 @@
             <w:fldChar w:fldCharType="begin"/>
           </w:r>
           <w:r>
-            <w:instrText xml:space="preserve"> HYPERLINK \l _Toc15898 </w:instrText>
+            <w:instrText xml:space="preserve"> HYPERLINK \l _Toc20417 </w:instrText>
           </w:r>
           <w:r>
             <w:fldChar w:fldCharType="separate"/>
@@ -1506,7 +1527,7 @@
             <w:fldChar w:fldCharType="begin"/>
           </w:r>
           <w:r>
-            <w:instrText xml:space="preserve"> PAGEREF _Toc15898 \h </w:instrText>
+            <w:instrText xml:space="preserve"> PAGEREF _Toc20417 \h </w:instrText>
           </w:r>
           <w:r>
             <w:fldChar w:fldCharType="separate"/>
@@ -1532,7 +1553,7 @@
             <w:fldChar w:fldCharType="begin"/>
           </w:r>
           <w:r>
-            <w:instrText xml:space="preserve"> HYPERLINK \l _Toc30298 </w:instrText>
+            <w:instrText xml:space="preserve"> HYPERLINK \l _Toc13728 </w:instrText>
           </w:r>
           <w:r>
             <w:fldChar w:fldCharType="separate"/>
@@ -1547,7 +1568,7 @@
             <w:fldChar w:fldCharType="begin"/>
           </w:r>
           <w:r>
-            <w:instrText xml:space="preserve"> PAGEREF _Toc30298 \h </w:instrText>
+            <w:instrText xml:space="preserve"> PAGEREF _Toc13728 \h </w:instrText>
           </w:r>
           <w:r>
             <w:fldChar w:fldCharType="separate"/>
@@ -1573,7 +1594,7 @@
             <w:fldChar w:fldCharType="begin"/>
           </w:r>
           <w:r>
-            <w:instrText xml:space="preserve"> HYPERLINK \l _Toc5447 </w:instrText>
+            <w:instrText xml:space="preserve"> HYPERLINK \l _Toc28685 </w:instrText>
           </w:r>
           <w:r>
             <w:fldChar w:fldCharType="separate"/>
@@ -1588,7 +1609,7 @@
             <w:fldChar w:fldCharType="begin"/>
           </w:r>
           <w:r>
-            <w:instrText xml:space="preserve"> PAGEREF _Toc5447 \h </w:instrText>
+            <w:instrText xml:space="preserve"> PAGEREF _Toc28685 \h </w:instrText>
           </w:r>
           <w:r>
             <w:fldChar w:fldCharType="separate"/>
@@ -1614,7 +1635,7 @@
             <w:fldChar w:fldCharType="begin"/>
           </w:r>
           <w:r>
-            <w:instrText xml:space="preserve"> HYPERLINK \l _Toc7846 </w:instrText>
+            <w:instrText xml:space="preserve"> HYPERLINK \l _Toc9369 </w:instrText>
           </w:r>
           <w:r>
             <w:fldChar w:fldCharType="separate"/>
@@ -1629,7 +1650,7 @@
             <w:fldChar w:fldCharType="begin"/>
           </w:r>
           <w:r>
-            <w:instrText xml:space="preserve"> PAGEREF _Toc7846 \h </w:instrText>
+            <w:instrText xml:space="preserve"> PAGEREF _Toc9369 \h </w:instrText>
           </w:r>
           <w:r>
             <w:fldChar w:fldCharType="separate"/>
@@ -1655,7 +1676,7 @@
             <w:fldChar w:fldCharType="begin"/>
           </w:r>
           <w:r>
-            <w:instrText xml:space="preserve"> HYPERLINK \l _Toc22658 </w:instrText>
+            <w:instrText xml:space="preserve"> HYPERLINK \l _Toc9128 </w:instrText>
           </w:r>
           <w:r>
             <w:fldChar w:fldCharType="separate"/>
@@ -1670,13 +1691,13 @@
             <w:fldChar w:fldCharType="begin"/>
           </w:r>
           <w:r>
-            <w:instrText xml:space="preserve"> PAGEREF _Toc22658 \h </w:instrText>
+            <w:instrText xml:space="preserve"> PAGEREF _Toc9128 \h </w:instrText>
           </w:r>
           <w:r>
             <w:fldChar w:fldCharType="separate"/>
           </w:r>
           <w:r>
-            <w:t>13</w:t>
+            <w:t>14</w:t>
           </w:r>
           <w:r>
             <w:fldChar w:fldCharType="end"/>
@@ -1696,7 +1717,7 @@
             <w:fldChar w:fldCharType="begin"/>
           </w:r>
           <w:r>
-            <w:instrText xml:space="preserve"> HYPERLINK \l _Toc20402 </w:instrText>
+            <w:instrText xml:space="preserve"> HYPERLINK \l _Toc14290 </w:instrText>
           </w:r>
           <w:r>
             <w:fldChar w:fldCharType="separate"/>
@@ -1711,7 +1732,7 @@
             <w:fldChar w:fldCharType="begin"/>
           </w:r>
           <w:r>
-            <w:instrText xml:space="preserve"> PAGEREF _Toc20402 \h </w:instrText>
+            <w:instrText xml:space="preserve"> PAGEREF _Toc14290 \h </w:instrText>
           </w:r>
           <w:r>
             <w:fldChar w:fldCharType="separate"/>
@@ -1737,7 +1758,7 @@
             <w:fldChar w:fldCharType="begin"/>
           </w:r>
           <w:r>
-            <w:instrText xml:space="preserve"> HYPERLINK \l _Toc18379 </w:instrText>
+            <w:instrText xml:space="preserve"> HYPERLINK \l _Toc20738 </w:instrText>
           </w:r>
           <w:r>
             <w:fldChar w:fldCharType="separate"/>
@@ -1752,7 +1773,7 @@
             <w:fldChar w:fldCharType="begin"/>
           </w:r>
           <w:r>
-            <w:instrText xml:space="preserve"> PAGEREF _Toc18379 \h </w:instrText>
+            <w:instrText xml:space="preserve"> PAGEREF _Toc20738 \h </w:instrText>
           </w:r>
           <w:r>
             <w:fldChar w:fldCharType="separate"/>
@@ -1778,7 +1799,7 @@
             <w:fldChar w:fldCharType="begin"/>
           </w:r>
           <w:r>
-            <w:instrText xml:space="preserve"> HYPERLINK \l _Toc8883 </w:instrText>
+            <w:instrText xml:space="preserve"> HYPERLINK \l _Toc10076 </w:instrText>
           </w:r>
           <w:r>
             <w:fldChar w:fldCharType="separate"/>
@@ -1793,7 +1814,7 @@
             <w:fldChar w:fldCharType="begin"/>
           </w:r>
           <w:r>
-            <w:instrText xml:space="preserve"> PAGEREF _Toc8883 \h </w:instrText>
+            <w:instrText xml:space="preserve"> PAGEREF _Toc10076 \h </w:instrText>
           </w:r>
           <w:r>
             <w:fldChar w:fldCharType="separate"/>
@@ -1819,7 +1840,7 @@
             <w:fldChar w:fldCharType="begin"/>
           </w:r>
           <w:r>
-            <w:instrText xml:space="preserve"> HYPERLINK \l _Toc29649 </w:instrText>
+            <w:instrText xml:space="preserve"> HYPERLINK \l _Toc5561 </w:instrText>
           </w:r>
           <w:r>
             <w:fldChar w:fldCharType="separate"/>
@@ -1834,7 +1855,7 @@
             <w:fldChar w:fldCharType="begin"/>
           </w:r>
           <w:r>
-            <w:instrText xml:space="preserve"> PAGEREF _Toc29649 \h </w:instrText>
+            <w:instrText xml:space="preserve"> PAGEREF _Toc5561 \h </w:instrText>
           </w:r>
           <w:r>
             <w:fldChar w:fldCharType="separate"/>
@@ -1860,7 +1881,7 @@
             <w:fldChar w:fldCharType="begin"/>
           </w:r>
           <w:r>
-            <w:instrText xml:space="preserve"> HYPERLINK \l _Toc6315 </w:instrText>
+            <w:instrText xml:space="preserve"> HYPERLINK \l _Toc12495 </w:instrText>
           </w:r>
           <w:r>
             <w:fldChar w:fldCharType="separate"/>
@@ -1875,7 +1896,7 @@
             <w:fldChar w:fldCharType="begin"/>
           </w:r>
           <w:r>
-            <w:instrText xml:space="preserve"> PAGEREF _Toc6315 \h </w:instrText>
+            <w:instrText xml:space="preserve"> PAGEREF _Toc12495 \h </w:instrText>
           </w:r>
           <w:r>
             <w:fldChar w:fldCharType="separate"/>
@@ -1901,7 +1922,7 @@
             <w:fldChar w:fldCharType="begin"/>
           </w:r>
           <w:r>
-            <w:instrText xml:space="preserve"> HYPERLINK \l _Toc26733 </w:instrText>
+            <w:instrText xml:space="preserve"> HYPERLINK \l _Toc15801 </w:instrText>
           </w:r>
           <w:r>
             <w:fldChar w:fldCharType="separate"/>
@@ -1916,7 +1937,7 @@
             <w:fldChar w:fldCharType="begin"/>
           </w:r>
           <w:r>
-            <w:instrText xml:space="preserve"> PAGEREF _Toc26733 \h </w:instrText>
+            <w:instrText xml:space="preserve"> PAGEREF _Toc15801 \h </w:instrText>
           </w:r>
           <w:r>
             <w:fldChar w:fldCharType="separate"/>
@@ -1942,7 +1963,7 @@
             <w:fldChar w:fldCharType="begin"/>
           </w:r>
           <w:r>
-            <w:instrText xml:space="preserve"> HYPERLINK \l _Toc26980 </w:instrText>
+            <w:instrText xml:space="preserve"> HYPERLINK \l _Toc2668 </w:instrText>
           </w:r>
           <w:r>
             <w:fldChar w:fldCharType="separate"/>
@@ -1957,7 +1978,7 @@
             <w:fldChar w:fldCharType="begin"/>
           </w:r>
           <w:r>
-            <w:instrText xml:space="preserve"> PAGEREF _Toc26980 \h </w:instrText>
+            <w:instrText xml:space="preserve"> PAGEREF _Toc2668 \h </w:instrText>
           </w:r>
           <w:r>
             <w:fldChar w:fldCharType="separate"/>
@@ -1983,7 +2004,7 @@
             <w:fldChar w:fldCharType="begin"/>
           </w:r>
           <w:r>
-            <w:instrText xml:space="preserve"> HYPERLINK \l _Toc21560 </w:instrText>
+            <w:instrText xml:space="preserve"> HYPERLINK \l _Toc24627 </w:instrText>
           </w:r>
           <w:r>
             <w:fldChar w:fldCharType="separate"/>
@@ -1998,7 +2019,7 @@
             <w:fldChar w:fldCharType="begin"/>
           </w:r>
           <w:r>
-            <w:instrText xml:space="preserve"> PAGEREF _Toc21560 \h </w:instrText>
+            <w:instrText xml:space="preserve"> PAGEREF _Toc24627 \h </w:instrText>
           </w:r>
           <w:r>
             <w:fldChar w:fldCharType="separate"/>
@@ -2024,7 +2045,7 @@
             <w:fldChar w:fldCharType="begin"/>
           </w:r>
           <w:r>
-            <w:instrText xml:space="preserve"> HYPERLINK \l _Toc20290 </w:instrText>
+            <w:instrText xml:space="preserve"> HYPERLINK \l _Toc10410 </w:instrText>
           </w:r>
           <w:r>
             <w:fldChar w:fldCharType="separate"/>
@@ -2039,7 +2060,7 @@
             <w:fldChar w:fldCharType="begin"/>
           </w:r>
           <w:r>
-            <w:instrText xml:space="preserve"> PAGEREF _Toc20290 \h </w:instrText>
+            <w:instrText xml:space="preserve"> PAGEREF _Toc10410 \h </w:instrText>
           </w:r>
           <w:r>
             <w:fldChar w:fldCharType="separate"/>
@@ -2065,7 +2086,7 @@
             <w:fldChar w:fldCharType="begin"/>
           </w:r>
           <w:r>
-            <w:instrText xml:space="preserve"> HYPERLINK \l _Toc23944 </w:instrText>
+            <w:instrText xml:space="preserve"> HYPERLINK \l _Toc14732 </w:instrText>
           </w:r>
           <w:r>
             <w:fldChar w:fldCharType="separate"/>
@@ -2080,7 +2101,7 @@
             <w:fldChar w:fldCharType="begin"/>
           </w:r>
           <w:r>
-            <w:instrText xml:space="preserve"> PAGEREF _Toc23944 \h </w:instrText>
+            <w:instrText xml:space="preserve"> PAGEREF _Toc14732 \h </w:instrText>
           </w:r>
           <w:r>
             <w:fldChar w:fldCharType="separate"/>
@@ -2106,7 +2127,7 @@
             <w:fldChar w:fldCharType="begin"/>
           </w:r>
           <w:r>
-            <w:instrText xml:space="preserve"> HYPERLINK \l _Toc24246 </w:instrText>
+            <w:instrText xml:space="preserve"> HYPERLINK \l _Toc12549 </w:instrText>
           </w:r>
           <w:r>
             <w:fldChar w:fldCharType="separate"/>
@@ -2121,7 +2142,7 @@
             <w:fldChar w:fldCharType="begin"/>
           </w:r>
           <w:r>
-            <w:instrText xml:space="preserve"> PAGEREF _Toc24246 \h </w:instrText>
+            <w:instrText xml:space="preserve"> PAGEREF _Toc12549 \h </w:instrText>
           </w:r>
           <w:r>
             <w:fldChar w:fldCharType="separate"/>
@@ -2147,7 +2168,7 @@
             <w:fldChar w:fldCharType="begin"/>
           </w:r>
           <w:r>
-            <w:instrText xml:space="preserve"> HYPERLINK \l _Toc6295 </w:instrText>
+            <w:instrText xml:space="preserve"> HYPERLINK \l _Toc20843 </w:instrText>
           </w:r>
           <w:r>
             <w:fldChar w:fldCharType="separate"/>
@@ -2162,7 +2183,7 @@
             <w:fldChar w:fldCharType="begin"/>
           </w:r>
           <w:r>
-            <w:instrText xml:space="preserve"> PAGEREF _Toc6295 \h </w:instrText>
+            <w:instrText xml:space="preserve"> PAGEREF _Toc20843 \h </w:instrText>
           </w:r>
           <w:r>
             <w:fldChar w:fldCharType="separate"/>
@@ -2188,7 +2209,7 @@
             <w:fldChar w:fldCharType="begin"/>
           </w:r>
           <w:r>
-            <w:instrText xml:space="preserve"> HYPERLINK \l _Toc11875 </w:instrText>
+            <w:instrText xml:space="preserve"> HYPERLINK \l _Toc3127 </w:instrText>
           </w:r>
           <w:r>
             <w:fldChar w:fldCharType="separate"/>
@@ -2203,7 +2224,7 @@
             <w:fldChar w:fldCharType="begin"/>
           </w:r>
           <w:r>
-            <w:instrText xml:space="preserve"> PAGEREF _Toc11875 \h </w:instrText>
+            <w:instrText xml:space="preserve"> PAGEREF _Toc3127 \h </w:instrText>
           </w:r>
           <w:r>
             <w:fldChar w:fldCharType="separate"/>
@@ -2229,7 +2250,7 @@
             <w:fldChar w:fldCharType="begin"/>
           </w:r>
           <w:r>
-            <w:instrText xml:space="preserve"> HYPERLINK \l _Toc28579 </w:instrText>
+            <w:instrText xml:space="preserve"> HYPERLINK \l _Toc13965 </w:instrText>
           </w:r>
           <w:r>
             <w:fldChar w:fldCharType="separate"/>
@@ -2244,7 +2265,7 @@
             <w:fldChar w:fldCharType="begin"/>
           </w:r>
           <w:r>
-            <w:instrText xml:space="preserve"> PAGEREF _Toc28579 \h </w:instrText>
+            <w:instrText xml:space="preserve"> PAGEREF _Toc13965 \h </w:instrText>
           </w:r>
           <w:r>
             <w:fldChar w:fldCharType="separate"/>
@@ -2270,7 +2291,7 @@
             <w:fldChar w:fldCharType="begin"/>
           </w:r>
           <w:r>
-            <w:instrText xml:space="preserve"> HYPERLINK \l _Toc32039 </w:instrText>
+            <w:instrText xml:space="preserve"> HYPERLINK \l _Toc23366 </w:instrText>
           </w:r>
           <w:r>
             <w:fldChar w:fldCharType="separate"/>
@@ -2285,7 +2306,7 @@
             <w:fldChar w:fldCharType="begin"/>
           </w:r>
           <w:r>
-            <w:instrText xml:space="preserve"> PAGEREF _Toc32039 \h </w:instrText>
+            <w:instrText xml:space="preserve"> PAGEREF _Toc23366 \h </w:instrText>
           </w:r>
           <w:r>
             <w:fldChar w:fldCharType="separate"/>
@@ -2311,7 +2332,7 @@
             <w:fldChar w:fldCharType="begin"/>
           </w:r>
           <w:r>
-            <w:instrText xml:space="preserve"> HYPERLINK \l _Toc5443 </w:instrText>
+            <w:instrText xml:space="preserve"> HYPERLINK \l _Toc9754 </w:instrText>
           </w:r>
           <w:r>
             <w:fldChar w:fldCharType="separate"/>
@@ -2326,7 +2347,7 @@
             <w:fldChar w:fldCharType="begin"/>
           </w:r>
           <w:r>
-            <w:instrText xml:space="preserve"> PAGEREF _Toc5443 \h </w:instrText>
+            <w:instrText xml:space="preserve"> PAGEREF _Toc9754 \h </w:instrText>
           </w:r>
           <w:r>
             <w:fldChar w:fldCharType="separate"/>
@@ -2352,7 +2373,7 @@
             <w:fldChar w:fldCharType="begin"/>
           </w:r>
           <w:r>
-            <w:instrText xml:space="preserve"> HYPERLINK \l _Toc11685 </w:instrText>
+            <w:instrText xml:space="preserve"> HYPERLINK \l _Toc28179 </w:instrText>
           </w:r>
           <w:r>
             <w:fldChar w:fldCharType="separate"/>
@@ -2367,7 +2388,7 @@
             <w:fldChar w:fldCharType="begin"/>
           </w:r>
           <w:r>
-            <w:instrText xml:space="preserve"> PAGEREF _Toc11685 \h </w:instrText>
+            <w:instrText xml:space="preserve"> PAGEREF _Toc28179 \h </w:instrText>
           </w:r>
           <w:r>
             <w:fldChar w:fldCharType="separate"/>
@@ -2393,7 +2414,7 @@
             <w:fldChar w:fldCharType="begin"/>
           </w:r>
           <w:r>
-            <w:instrText xml:space="preserve"> HYPERLINK \l _Toc6736 </w:instrText>
+            <w:instrText xml:space="preserve"> HYPERLINK \l _Toc25209 </w:instrText>
           </w:r>
           <w:r>
             <w:fldChar w:fldCharType="separate"/>
@@ -2408,7 +2429,7 @@
             <w:fldChar w:fldCharType="begin"/>
           </w:r>
           <w:r>
-            <w:instrText xml:space="preserve"> PAGEREF _Toc6736 \h </w:instrText>
+            <w:instrText xml:space="preserve"> PAGEREF _Toc25209 \h </w:instrText>
           </w:r>
           <w:r>
             <w:fldChar w:fldCharType="separate"/>
@@ -2434,7 +2455,7 @@
             <w:fldChar w:fldCharType="begin"/>
           </w:r>
           <w:r>
-            <w:instrText xml:space="preserve"> HYPERLINK \l _Toc27406 </w:instrText>
+            <w:instrText xml:space="preserve"> HYPERLINK \l _Toc3915 </w:instrText>
           </w:r>
           <w:r>
             <w:fldChar w:fldCharType="separate"/>
@@ -2449,7 +2470,7 @@
             <w:fldChar w:fldCharType="begin"/>
           </w:r>
           <w:r>
-            <w:instrText xml:space="preserve"> PAGEREF _Toc27406 \h </w:instrText>
+            <w:instrText xml:space="preserve"> PAGEREF _Toc3915 \h </w:instrText>
           </w:r>
           <w:r>
             <w:fldChar w:fldCharType="separate"/>
@@ -2475,7 +2496,7 @@
             <w:fldChar w:fldCharType="begin"/>
           </w:r>
           <w:r>
-            <w:instrText xml:space="preserve"> HYPERLINK \l _Toc19463 </w:instrText>
+            <w:instrText xml:space="preserve"> HYPERLINK \l _Toc24059 </w:instrText>
           </w:r>
           <w:r>
             <w:fldChar w:fldCharType="separate"/>
@@ -2490,7 +2511,7 @@
             <w:fldChar w:fldCharType="begin"/>
           </w:r>
           <w:r>
-            <w:instrText xml:space="preserve"> PAGEREF _Toc19463 \h </w:instrText>
+            <w:instrText xml:space="preserve"> PAGEREF _Toc24059 \h </w:instrText>
           </w:r>
           <w:r>
             <w:fldChar w:fldCharType="separate"/>
@@ -2516,7 +2537,7 @@
             <w:fldChar w:fldCharType="begin"/>
           </w:r>
           <w:r>
-            <w:instrText xml:space="preserve"> HYPERLINK \l _Toc10548 </w:instrText>
+            <w:instrText xml:space="preserve"> HYPERLINK \l _Toc22756 </w:instrText>
           </w:r>
           <w:r>
             <w:fldChar w:fldCharType="separate"/>
@@ -2531,7 +2552,7 @@
             <w:fldChar w:fldCharType="begin"/>
           </w:r>
           <w:r>
-            <w:instrText xml:space="preserve"> PAGEREF _Toc10548 \h </w:instrText>
+            <w:instrText xml:space="preserve"> PAGEREF _Toc22756 \h </w:instrText>
           </w:r>
           <w:r>
             <w:fldChar w:fldCharType="separate"/>
@@ -2557,7 +2578,7 @@
             <w:fldChar w:fldCharType="begin"/>
           </w:r>
           <w:r>
-            <w:instrText xml:space="preserve"> HYPERLINK \l _Toc25683 </w:instrText>
+            <w:instrText xml:space="preserve"> HYPERLINK \l _Toc16359 </w:instrText>
           </w:r>
           <w:r>
             <w:fldChar w:fldCharType="separate"/>
@@ -2572,7 +2593,7 @@
             <w:fldChar w:fldCharType="begin"/>
           </w:r>
           <w:r>
-            <w:instrText xml:space="preserve"> PAGEREF _Toc25683 \h </w:instrText>
+            <w:instrText xml:space="preserve"> PAGEREF _Toc16359 \h </w:instrText>
           </w:r>
           <w:r>
             <w:fldChar w:fldCharType="separate"/>
@@ -2598,7 +2619,7 @@
             <w:fldChar w:fldCharType="begin"/>
           </w:r>
           <w:r>
-            <w:instrText xml:space="preserve"> HYPERLINK \l _Toc557 </w:instrText>
+            <w:instrText xml:space="preserve"> HYPERLINK \l _Toc7574 </w:instrText>
           </w:r>
           <w:r>
             <w:fldChar w:fldCharType="separate"/>
@@ -2613,7 +2634,7 @@
             <w:fldChar w:fldCharType="begin"/>
           </w:r>
           <w:r>
-            <w:instrText xml:space="preserve"> PAGEREF _Toc557 \h </w:instrText>
+            <w:instrText xml:space="preserve"> PAGEREF _Toc7574 \h </w:instrText>
           </w:r>
           <w:r>
             <w:fldChar w:fldCharType="separate"/>
@@ -2639,7 +2660,7 @@
             <w:fldChar w:fldCharType="begin"/>
           </w:r>
           <w:r>
-            <w:instrText xml:space="preserve"> HYPERLINK \l _Toc9576 </w:instrText>
+            <w:instrText xml:space="preserve"> HYPERLINK \l _Toc16022 </w:instrText>
           </w:r>
           <w:r>
             <w:fldChar w:fldCharType="separate"/>
@@ -2654,7 +2675,7 @@
             <w:fldChar w:fldCharType="begin"/>
           </w:r>
           <w:r>
-            <w:instrText xml:space="preserve"> PAGEREF _Toc9576 \h </w:instrText>
+            <w:instrText xml:space="preserve"> PAGEREF _Toc16022 \h </w:instrText>
           </w:r>
           <w:r>
             <w:fldChar w:fldCharType="separate"/>
@@ -2680,7 +2701,7 @@
             <w:fldChar w:fldCharType="begin"/>
           </w:r>
           <w:r>
-            <w:instrText xml:space="preserve"> HYPERLINK \l _Toc17934 </w:instrText>
+            <w:instrText xml:space="preserve"> HYPERLINK \l _Toc5858 </w:instrText>
           </w:r>
           <w:r>
             <w:fldChar w:fldCharType="separate"/>
@@ -2695,7 +2716,7 @@
             <w:fldChar w:fldCharType="begin"/>
           </w:r>
           <w:r>
-            <w:instrText xml:space="preserve"> PAGEREF _Toc17934 \h </w:instrText>
+            <w:instrText xml:space="preserve"> PAGEREF _Toc5858 \h </w:instrText>
           </w:r>
           <w:r>
             <w:fldChar w:fldCharType="separate"/>
@@ -2727,7 +2748,7 @@
         <w:pStyle w:val="22"/>
         <w:pageBreakBefore/>
       </w:pPr>
-      <w:bookmarkStart w:id="2" w:name="_Toc17657"/>
+      <w:bookmarkStart w:id="2" w:name="_Toc15610"/>
       <w:r>
         <w:t>圖目錄</w:t>
       </w:r>
@@ -2736,7 +2757,7 @@
     <w:sdt>
       <w:sdtPr>
         <w:alias w:val="圖目錄"/>
-        <w:id w:val="147474029"/>
+        <w:id w:val="147459295"/>
       </w:sdtPr>
       <w:sdtContent>
         <w:p>
@@ -2771,7 +2792,7 @@
             <w:fldChar w:fldCharType="begin"/>
           </w:r>
           <w:r>
-            <w:instrText xml:space="preserve"> HYPERLINK \l _Toc775 </w:instrText>
+            <w:instrText xml:space="preserve"> HYPERLINK \l _Toc24517 </w:instrText>
           </w:r>
           <w:r>
             <w:fldChar w:fldCharType="separate"/>
@@ -2786,7 +2807,7 @@
             <w:fldChar w:fldCharType="begin"/>
           </w:r>
           <w:r>
-            <w:instrText xml:space="preserve"> PAGEREF _Toc775 \h </w:instrText>
+            <w:instrText xml:space="preserve"> PAGEREF _Toc24517 \h </w:instrText>
           </w:r>
           <w:r>
             <w:fldChar w:fldCharType="separate"/>
@@ -2812,7 +2833,7 @@
             <w:fldChar w:fldCharType="begin"/>
           </w:r>
           <w:r>
-            <w:instrText xml:space="preserve"> HYPERLINK \l _Toc30089 </w:instrText>
+            <w:instrText xml:space="preserve"> HYPERLINK \l _Toc17587 </w:instrText>
           </w:r>
           <w:r>
             <w:fldChar w:fldCharType="separate"/>
@@ -2827,7 +2848,7 @@
             <w:fldChar w:fldCharType="begin"/>
           </w:r>
           <w:r>
-            <w:instrText xml:space="preserve"> PAGEREF _Toc30089 \h </w:instrText>
+            <w:instrText xml:space="preserve"> PAGEREF _Toc17587 \h </w:instrText>
           </w:r>
           <w:r>
             <w:fldChar w:fldCharType="separate"/>
@@ -2853,7 +2874,7 @@
             <w:fldChar w:fldCharType="begin"/>
           </w:r>
           <w:r>
-            <w:instrText xml:space="preserve"> HYPERLINK \l _Toc20269 </w:instrText>
+            <w:instrText xml:space="preserve"> HYPERLINK \l _Toc30806 </w:instrText>
           </w:r>
           <w:r>
             <w:fldChar w:fldCharType="separate"/>
@@ -2868,7 +2889,7 @@
             <w:fldChar w:fldCharType="begin"/>
           </w:r>
           <w:r>
-            <w:instrText xml:space="preserve"> PAGEREF _Toc20269 \h </w:instrText>
+            <w:instrText xml:space="preserve"> PAGEREF _Toc30806 \h </w:instrText>
           </w:r>
           <w:r>
             <w:fldChar w:fldCharType="separate"/>
@@ -2894,7 +2915,7 @@
             <w:fldChar w:fldCharType="begin"/>
           </w:r>
           <w:r>
-            <w:instrText xml:space="preserve"> HYPERLINK \l _Toc26227 </w:instrText>
+            <w:instrText xml:space="preserve"> HYPERLINK \l _Toc4759 </w:instrText>
           </w:r>
           <w:r>
             <w:fldChar w:fldCharType="separate"/>
@@ -2909,7 +2930,7 @@
             <w:fldChar w:fldCharType="begin"/>
           </w:r>
           <w:r>
-            <w:instrText xml:space="preserve"> PAGEREF _Toc26227 \h </w:instrText>
+            <w:instrText xml:space="preserve"> PAGEREF _Toc4759 \h </w:instrText>
           </w:r>
           <w:r>
             <w:fldChar w:fldCharType="separate"/>
@@ -2935,7 +2956,7 @@
             <w:fldChar w:fldCharType="begin"/>
           </w:r>
           <w:r>
-            <w:instrText xml:space="preserve"> HYPERLINK \l _Toc19710 </w:instrText>
+            <w:instrText xml:space="preserve"> HYPERLINK \l _Toc20229 </w:instrText>
           </w:r>
           <w:r>
             <w:fldChar w:fldCharType="separate"/>
@@ -2950,7 +2971,7 @@
             <w:fldChar w:fldCharType="begin"/>
           </w:r>
           <w:r>
-            <w:instrText xml:space="preserve"> PAGEREF _Toc19710 \h </w:instrText>
+            <w:instrText xml:space="preserve"> PAGEREF _Toc20229 \h </w:instrText>
           </w:r>
           <w:r>
             <w:fldChar w:fldCharType="separate"/>
@@ -2982,7 +3003,7 @@
         <w:pStyle w:val="22"/>
         <w:pageBreakBefore/>
       </w:pPr>
-      <w:bookmarkStart w:id="3" w:name="_Toc12208"/>
+      <w:bookmarkStart w:id="3" w:name="_Toc7755"/>
       <w:r>
         <w:t>表目錄</w:t>
       </w:r>
@@ -2991,7 +3012,7 @@
     <w:sdt>
       <w:sdtPr>
         <w:alias w:val="表目錄"/>
-        <w:id w:val="147478333"/>
+        <w:id w:val="147452267"/>
       </w:sdtPr>
       <w:sdtContent>
         <w:p>
@@ -3026,7 +3047,7 @@
             <w:fldChar w:fldCharType="begin"/>
           </w:r>
           <w:r>
-            <w:instrText xml:space="preserve"> HYPERLINK \l _Toc2426 </w:instrText>
+            <w:instrText xml:space="preserve"> HYPERLINK \l _Toc14363 </w:instrText>
           </w:r>
           <w:r>
             <w:fldChar w:fldCharType="separate"/>
@@ -3041,7 +3062,7 @@
             <w:fldChar w:fldCharType="begin"/>
           </w:r>
           <w:r>
-            <w:instrText xml:space="preserve"> PAGEREF _Toc2426 \h </w:instrText>
+            <w:instrText xml:space="preserve"> PAGEREF _Toc14363 \h </w:instrText>
           </w:r>
           <w:r>
             <w:fldChar w:fldCharType="separate"/>
@@ -3067,7 +3088,7 @@
             <w:fldChar w:fldCharType="begin"/>
           </w:r>
           <w:r>
-            <w:instrText xml:space="preserve"> HYPERLINK \l _Toc25631 </w:instrText>
+            <w:instrText xml:space="preserve"> HYPERLINK \l _Toc8674 </w:instrText>
           </w:r>
           <w:r>
             <w:fldChar w:fldCharType="separate"/>
@@ -3082,7 +3103,7 @@
             <w:fldChar w:fldCharType="begin"/>
           </w:r>
           <w:r>
-            <w:instrText xml:space="preserve"> PAGEREF _Toc25631 \h </w:instrText>
+            <w:instrText xml:space="preserve"> PAGEREF _Toc8674 \h </w:instrText>
           </w:r>
           <w:r>
             <w:fldChar w:fldCharType="separate"/>
@@ -3108,7 +3129,7 @@
             <w:fldChar w:fldCharType="begin"/>
           </w:r>
           <w:r>
-            <w:instrText xml:space="preserve"> HYPERLINK \l _Toc17046 </w:instrText>
+            <w:instrText xml:space="preserve"> HYPERLINK \l _Toc13538 </w:instrText>
           </w:r>
           <w:r>
             <w:fldChar w:fldCharType="separate"/>
@@ -3123,7 +3144,7 @@
             <w:fldChar w:fldCharType="begin"/>
           </w:r>
           <w:r>
-            <w:instrText xml:space="preserve"> PAGEREF _Toc17046 \h </w:instrText>
+            <w:instrText xml:space="preserve"> PAGEREF _Toc13538 \h </w:instrText>
           </w:r>
           <w:r>
             <w:fldChar w:fldCharType="separate"/>
@@ -3149,7 +3170,7 @@
             <w:fldChar w:fldCharType="begin"/>
           </w:r>
           <w:r>
-            <w:instrText xml:space="preserve"> HYPERLINK \l _Toc16360 </w:instrText>
+            <w:instrText xml:space="preserve"> HYPERLINK \l _Toc3220 </w:instrText>
           </w:r>
           <w:r>
             <w:fldChar w:fldCharType="separate"/>
@@ -3164,7 +3185,7 @@
             <w:fldChar w:fldCharType="begin"/>
           </w:r>
           <w:r>
-            <w:instrText xml:space="preserve"> PAGEREF _Toc16360 \h </w:instrText>
+            <w:instrText xml:space="preserve"> PAGEREF _Toc3220 \h </w:instrText>
           </w:r>
           <w:r>
             <w:fldChar w:fldCharType="separate"/>
@@ -3190,7 +3211,7 @@
             <w:fldChar w:fldCharType="begin"/>
           </w:r>
           <w:r>
-            <w:instrText xml:space="preserve"> HYPERLINK \l _Toc4606 </w:instrText>
+            <w:instrText xml:space="preserve"> HYPERLINK \l _Toc3674 </w:instrText>
           </w:r>
           <w:r>
             <w:fldChar w:fldCharType="separate"/>
@@ -3205,7 +3226,7 @@
             <w:fldChar w:fldCharType="begin"/>
           </w:r>
           <w:r>
-            <w:instrText xml:space="preserve"> PAGEREF _Toc4606 \h </w:instrText>
+            <w:instrText xml:space="preserve"> PAGEREF _Toc3674 \h </w:instrText>
           </w:r>
           <w:r>
             <w:fldChar w:fldCharType="separate"/>
@@ -3231,7 +3252,7 @@
             <w:fldChar w:fldCharType="begin"/>
           </w:r>
           <w:r>
-            <w:instrText xml:space="preserve"> HYPERLINK \l _Toc16654 </w:instrText>
+            <w:instrText xml:space="preserve"> HYPERLINK \l _Toc32170 </w:instrText>
           </w:r>
           <w:r>
             <w:fldChar w:fldCharType="separate"/>
@@ -3246,7 +3267,7 @@
             <w:fldChar w:fldCharType="begin"/>
           </w:r>
           <w:r>
-            <w:instrText xml:space="preserve"> PAGEREF _Toc16654 \h </w:instrText>
+            <w:instrText xml:space="preserve"> PAGEREF _Toc32170 \h </w:instrText>
           </w:r>
           <w:r>
             <w:fldChar w:fldCharType="separate"/>
@@ -3272,7 +3293,7 @@
             <w:fldChar w:fldCharType="begin"/>
           </w:r>
           <w:r>
-            <w:instrText xml:space="preserve"> HYPERLINK \l _Toc31129 </w:instrText>
+            <w:instrText xml:space="preserve"> HYPERLINK \l _Toc25666 </w:instrText>
           </w:r>
           <w:r>
             <w:fldChar w:fldCharType="separate"/>
@@ -3287,7 +3308,7 @@
             <w:fldChar w:fldCharType="begin"/>
           </w:r>
           <w:r>
-            <w:instrText xml:space="preserve"> PAGEREF _Toc31129 \h </w:instrText>
+            <w:instrText xml:space="preserve"> PAGEREF _Toc25666 \h </w:instrText>
           </w:r>
           <w:r>
             <w:fldChar w:fldCharType="separate"/>
@@ -3313,7 +3334,7 @@
             <w:fldChar w:fldCharType="begin"/>
           </w:r>
           <w:r>
-            <w:instrText xml:space="preserve"> HYPERLINK \l _Toc7606 </w:instrText>
+            <w:instrText xml:space="preserve"> HYPERLINK \l _Toc7052 </w:instrText>
           </w:r>
           <w:r>
             <w:fldChar w:fldCharType="separate"/>
@@ -3328,7 +3349,7 @@
             <w:fldChar w:fldCharType="begin"/>
           </w:r>
           <w:r>
-            <w:instrText xml:space="preserve"> PAGEREF _Toc7606 \h </w:instrText>
+            <w:instrText xml:space="preserve"> PAGEREF _Toc7052 \h </w:instrText>
           </w:r>
           <w:r>
             <w:fldChar w:fldCharType="separate"/>
@@ -3354,7 +3375,7 @@
             <w:fldChar w:fldCharType="begin"/>
           </w:r>
           <w:r>
-            <w:instrText xml:space="preserve"> HYPERLINK \l _Toc11090 </w:instrText>
+            <w:instrText xml:space="preserve"> HYPERLINK \l _Toc23149 </w:instrText>
           </w:r>
           <w:r>
             <w:fldChar w:fldCharType="separate"/>
@@ -3369,7 +3390,7 @@
             <w:fldChar w:fldCharType="begin"/>
           </w:r>
           <w:r>
-            <w:instrText xml:space="preserve"> PAGEREF _Toc11090 \h </w:instrText>
+            <w:instrText xml:space="preserve"> PAGEREF _Toc23149 \h </w:instrText>
           </w:r>
           <w:r>
             <w:fldChar w:fldCharType="separate"/>
@@ -3395,7 +3416,7 @@
             <w:fldChar w:fldCharType="begin"/>
           </w:r>
           <w:r>
-            <w:instrText xml:space="preserve"> HYPERLINK \l _Toc11028 </w:instrText>
+            <w:instrText xml:space="preserve"> HYPERLINK \l _Toc15808 </w:instrText>
           </w:r>
           <w:r>
             <w:fldChar w:fldCharType="separate"/>
@@ -3410,7 +3431,7 @@
             <w:fldChar w:fldCharType="begin"/>
           </w:r>
           <w:r>
-            <w:instrText xml:space="preserve"> PAGEREF _Toc11028 \h </w:instrText>
+            <w:instrText xml:space="preserve"> PAGEREF _Toc15808 \h </w:instrText>
           </w:r>
           <w:r>
             <w:fldChar w:fldCharType="separate"/>
@@ -3436,7 +3457,7 @@
             <w:fldChar w:fldCharType="begin"/>
           </w:r>
           <w:r>
-            <w:instrText xml:space="preserve"> HYPERLINK \l _Toc11960 </w:instrText>
+            <w:instrText xml:space="preserve"> HYPERLINK \l _Toc2385 </w:instrText>
           </w:r>
           <w:r>
             <w:fldChar w:fldCharType="separate"/>
@@ -3451,7 +3472,7 @@
             <w:fldChar w:fldCharType="begin"/>
           </w:r>
           <w:r>
-            <w:instrText xml:space="preserve"> PAGEREF _Toc11960 \h </w:instrText>
+            <w:instrText xml:space="preserve"> PAGEREF _Toc2385 \h </w:instrText>
           </w:r>
           <w:r>
             <w:fldChar w:fldCharType="separate"/>
@@ -3477,7 +3498,7 @@
             <w:fldChar w:fldCharType="begin"/>
           </w:r>
           <w:r>
-            <w:instrText xml:space="preserve"> HYPERLINK \l _Toc25855 </w:instrText>
+            <w:instrText xml:space="preserve"> HYPERLINK \l _Toc1450 </w:instrText>
           </w:r>
           <w:r>
             <w:fldChar w:fldCharType="separate"/>
@@ -3492,7 +3513,7 @@
             <w:fldChar w:fldCharType="begin"/>
           </w:r>
           <w:r>
-            <w:instrText xml:space="preserve"> PAGEREF _Toc25855 \h </w:instrText>
+            <w:instrText xml:space="preserve"> PAGEREF _Toc1450 \h </w:instrText>
           </w:r>
           <w:r>
             <w:fldChar w:fldCharType="separate"/>
@@ -3518,7 +3539,7 @@
             <w:fldChar w:fldCharType="begin"/>
           </w:r>
           <w:r>
-            <w:instrText xml:space="preserve"> HYPERLINK \l _Toc24772 </w:instrText>
+            <w:instrText xml:space="preserve"> HYPERLINK \l _Toc29806 </w:instrText>
           </w:r>
           <w:r>
             <w:fldChar w:fldCharType="separate"/>
@@ -3533,7 +3554,7 @@
             <w:fldChar w:fldCharType="begin"/>
           </w:r>
           <w:r>
-            <w:instrText xml:space="preserve"> PAGEREF _Toc24772 \h </w:instrText>
+            <w:instrText xml:space="preserve"> PAGEREF _Toc29806 \h </w:instrText>
           </w:r>
           <w:r>
             <w:fldChar w:fldCharType="separate"/>
@@ -3577,7 +3598,7 @@
         <w:pStyle w:val="2"/>
         <w:pageBreakBefore/>
       </w:pPr>
-      <w:bookmarkStart w:id="4" w:name="_Toc17683"/>
+      <w:bookmarkStart w:id="4" w:name="_Toc1915"/>
       <w:r>
         <w:t>第一章 緒論</w:t>
       </w:r>
@@ -3587,7 +3608,7 @@
       <w:pPr>
         <w:pStyle w:val="3"/>
       </w:pPr>
-      <w:bookmarkStart w:id="5" w:name="_Toc27333"/>
+      <w:bookmarkStart w:id="5" w:name="_Toc692"/>
       <w:r>
         <w:t>1.1 研究背景</w:t>
       </w:r>
@@ -3627,7 +3648,7 @@
       <w:pPr>
         <w:pStyle w:val="3"/>
       </w:pPr>
-      <w:bookmarkStart w:id="6" w:name="_Toc21708"/>
+      <w:bookmarkStart w:id="6" w:name="_Toc4634"/>
       <w:r>
         <w:t>1.2 研究動機</w:t>
       </w:r>
@@ -3667,7 +3688,7 @@
       <w:pPr>
         <w:pStyle w:val="3"/>
       </w:pPr>
-      <w:bookmarkStart w:id="7" w:name="_Toc8015"/>
+      <w:bookmarkStart w:id="7" w:name="_Toc12392"/>
       <w:r>
         <w:t>1.3 研究問題</w:t>
       </w:r>
@@ -3738,7 +3759,7 @@
       <w:pPr>
         <w:pStyle w:val="3"/>
       </w:pPr>
-      <w:bookmarkStart w:id="8" w:name="_Toc6195"/>
+      <w:bookmarkStart w:id="8" w:name="_Toc16623"/>
       <w:r>
         <w:t>1.4 研究目的</w:t>
       </w:r>
@@ -3828,7 +3849,7 @@
       <w:pPr>
         <w:pStyle w:val="3"/>
       </w:pPr>
-      <w:bookmarkStart w:id="9" w:name="_Toc3508"/>
+      <w:bookmarkStart w:id="9" w:name="_Toc6710"/>
       <w:r>
         <w:t>1.5 研究範圍</w:t>
       </w:r>
@@ -3858,7 +3879,7 @@
       <w:pPr>
         <w:pStyle w:val="3"/>
       </w:pPr>
-      <w:bookmarkStart w:id="10" w:name="_Toc4184"/>
+      <w:bookmarkStart w:id="10" w:name="_Toc17984"/>
       <w:r>
         <w:t>1.6 研究流程與章節結構</w:t>
       </w:r>
@@ -3925,7 +3946,7 @@
       <w:pPr>
         <w:pStyle w:val="24"/>
       </w:pPr>
-      <w:bookmarkStart w:id="11" w:name="_Toc775"/>
+      <w:bookmarkStart w:id="11" w:name="_Toc24517"/>
       <w:r>
         <w:t>圖1.1 研究流程</w:t>
       </w:r>
@@ -3946,7 +3967,7 @@
         <w:pStyle w:val="2"/>
         <w:pageBreakBefore/>
       </w:pPr>
-      <w:bookmarkStart w:id="12" w:name="_Toc5090"/>
+      <w:bookmarkStart w:id="12" w:name="_Toc20792"/>
       <w:r>
         <w:t>第二章 相關文獻回顧</w:t>
       </w:r>
@@ -3956,7 +3977,7 @@
       <w:pPr>
         <w:pStyle w:val="3"/>
       </w:pPr>
-      <w:bookmarkStart w:id="13" w:name="_Toc2066"/>
+      <w:bookmarkStart w:id="13" w:name="_Toc7932"/>
       <w:r>
         <w:t>2.1 檢索增強生成</w:t>
       </w:r>
@@ -3986,7 +4007,7 @@
       <w:pPr>
         <w:pStyle w:val="3"/>
       </w:pPr>
-      <w:bookmarkStart w:id="14" w:name="_Toc2955"/>
+      <w:bookmarkStart w:id="14" w:name="_Toc21975"/>
       <w:r>
         <w:t>2.2 知識衝突與資訊時效</w:t>
       </w:r>
@@ -4016,7 +4037,7 @@
       <w:pPr>
         <w:pStyle w:val="3"/>
       </w:pPr>
-      <w:bookmarkStart w:id="15" w:name="_Toc2993"/>
+      <w:bookmarkStart w:id="15" w:name="_Toc19518"/>
       <w:r>
         <w:t>2.3 文件相似度與近似重複偵測</w:t>
       </w:r>
@@ -4046,7 +4067,7 @@
       <w:pPr>
         <w:pStyle w:val="3"/>
       </w:pPr>
-      <w:bookmarkStart w:id="16" w:name="_Toc11138"/>
+      <w:bookmarkStart w:id="16" w:name="_Toc26068"/>
       <w:r>
         <w:t>2.4 以大型語言模型作為判斷者</w:t>
       </w:r>
@@ -4066,7 +4087,7 @@
       <w:pPr>
         <w:pStyle w:val="3"/>
       </w:pPr>
-      <w:bookmarkStart w:id="17" w:name="_Toc27511"/>
+      <w:bookmarkStart w:id="17" w:name="_Toc31142"/>
       <w:r>
         <w:t>2.5 輕量化語言模型與結構化輸出</w:t>
       </w:r>
@@ -4106,7 +4127,7 @@
       <w:pPr>
         <w:pStyle w:val="3"/>
       </w:pPr>
-      <w:bookmarkStart w:id="18" w:name="_Toc3275"/>
+      <w:bookmarkStart w:id="18" w:name="_Toc22432"/>
       <w:r>
         <w:t>2.6 級聯方法</w:t>
       </w:r>
@@ -4126,7 +4147,7 @@
       <w:pPr>
         <w:pStyle w:val="3"/>
       </w:pPr>
-      <w:bookmarkStart w:id="19" w:name="_Toc1761"/>
+      <w:bookmarkStart w:id="19" w:name="_Toc32721"/>
       <w:r>
         <w:t>2.7 與本研究的差異</w:t>
       </w:r>
@@ -4147,7 +4168,7 @@
         <w:pStyle w:val="25"/>
         <w:keepNext/>
       </w:pPr>
-      <w:bookmarkStart w:id="20" w:name="_Toc2426"/>
+      <w:bookmarkStart w:id="20" w:name="_Toc14363"/>
       <w:r>
         <w:t>表2.1 相關研究與本研究之比較</w:t>
       </w:r>
@@ -5299,7 +5320,7 @@
         <w:pStyle w:val="2"/>
         <w:pageBreakBefore/>
       </w:pPr>
-      <w:bookmarkStart w:id="21" w:name="_Toc14682"/>
+      <w:bookmarkStart w:id="21" w:name="_Toc21908"/>
       <w:r>
         <w:t>第三章 系統設計與研究方法</w:t>
       </w:r>
@@ -5309,7 +5330,7 @@
       <w:pPr>
         <w:pStyle w:val="3"/>
       </w:pPr>
-      <w:bookmarkStart w:id="22" w:name="_Toc20211"/>
+      <w:bookmarkStart w:id="22" w:name="_Toc27446"/>
       <w:r>
         <w:t>3.1 問題定義</w:t>
       </w:r>
@@ -5461,7 +5482,7 @@
       <w:pPr>
         <w:pStyle w:val="24"/>
       </w:pPr>
-      <w:bookmarkStart w:id="23" w:name="_Toc30089"/>
+      <w:bookmarkStart w:id="23" w:name="_Toc17587"/>
       <w:r>
         <w:t>圖3.1 判斷程序</w:t>
       </w:r>
@@ -5482,14 +5503,14 @@
           <w:bCs/>
           <w:color w:val="1F4E9A"/>
         </w:rPr>
-        <w:t>此外，秋季與春季、第一學期與第二學期的同名計畫視為不同的週期性計畫：新文件只會取代同一學期別的舊公告；若只有另一學期別的舊公告，則判為 NEW。</w:t>
+        <w:t>若同一計畫同時有秋季與春季（或第一與第二學期）的舊公告，被取代的文件優先選擇與新文件同一學期別的最新一份。</w:t>
       </w:r>
     </w:p>
     <w:p>
       <w:pPr>
         <w:pStyle w:val="3"/>
       </w:pPr>
-      <w:bookmarkStart w:id="24" w:name="_Toc6546"/>
+      <w:bookmarkStart w:id="24" w:name="_Toc8133"/>
       <w:r>
         <w:t>3.2 系統架構</w:t>
       </w:r>
@@ -5556,7 +5577,7 @@
       <w:pPr>
         <w:pStyle w:val="24"/>
       </w:pPr>
-      <w:bookmarkStart w:id="25" w:name="_Toc20269"/>
+      <w:bookmarkStart w:id="25" w:name="_Toc30806"/>
       <w:r>
         <w:t>圖3.2 系統架構</w:t>
       </w:r>
@@ -5566,7 +5587,7 @@
       <w:pPr>
         <w:pStyle w:val="3"/>
       </w:pPr>
-      <w:bookmarkStart w:id="26" w:name="_Toc8229"/>
+      <w:bookmarkStart w:id="26" w:name="_Toc13095"/>
       <w:r>
         <w:t>3.3 資料蒐集</w:t>
       </w:r>
@@ -5587,7 +5608,7 @@
         <w:pStyle w:val="25"/>
         <w:keepNext/>
       </w:pPr>
-      <w:bookmarkStart w:id="27" w:name="_Toc25631"/>
+      <w:bookmarkStart w:id="27" w:name="_Toc8674"/>
       <w:r>
         <w:t>表3.1 資料集統計</w:t>
       </w:r>
@@ -6160,7 +6181,7 @@
       <w:pPr>
         <w:pStyle w:val="3"/>
       </w:pPr>
-      <w:bookmarkStart w:id="28" w:name="_Toc32520"/>
+      <w:bookmarkStart w:id="28" w:name="_Toc29057"/>
       <w:r>
         <w:t>3.4 文件讀取與前處理</w:t>
       </w:r>
@@ -6190,7 +6211,7 @@
       <w:pPr>
         <w:pStyle w:val="3"/>
       </w:pPr>
-      <w:bookmarkStart w:id="29" w:name="_Toc22710"/>
+      <w:bookmarkStart w:id="29" w:name="_Toc27100"/>
       <w:r>
         <w:t>3.5 相似度訊號</w:t>
       </w:r>
@@ -6711,7 +6732,7 @@
       <w:pPr>
         <w:pStyle w:val="4"/>
       </w:pPr>
-      <w:bookmarkStart w:id="30" w:name="_Toc15898"/>
+      <w:bookmarkStart w:id="30" w:name="_Toc20417"/>
       <w:r>
         <w:t>3.5.1 相似度模型的選擇理由</w:t>
       </w:r>
@@ -6812,7 +6833,7 @@
       <w:pPr>
         <w:pStyle w:val="3"/>
       </w:pPr>
-      <w:bookmarkStart w:id="31" w:name="_Toc30298"/>
+      <w:bookmarkStart w:id="31" w:name="_Toc13728"/>
       <w:r>
         <w:t>3.6 比較方法</w:t>
       </w:r>
@@ -6833,7 +6854,7 @@
         <w:pStyle w:val="25"/>
         <w:keepNext/>
       </w:pPr>
-      <w:bookmarkStart w:id="32" w:name="_Toc17046"/>
+      <w:bookmarkStart w:id="32" w:name="_Toc13538"/>
       <w:r>
         <w:t>表3.2 比較方法一覽</w:t>
       </w:r>
@@ -8064,7 +8085,7 @@
       <w:pPr>
         <w:pStyle w:val="4"/>
       </w:pPr>
-      <w:bookmarkStart w:id="33" w:name="_Toc5447"/>
+      <w:bookmarkStart w:id="33" w:name="_Toc28685"/>
       <w:r>
         <w:t>3.6.1 比較的語言模型</w:t>
       </w:r>
@@ -8085,7 +8106,7 @@
         <w:pStyle w:val="25"/>
         <w:keepNext/>
       </w:pPr>
-      <w:bookmarkStart w:id="34" w:name="_Toc16360"/>
+      <w:bookmarkStart w:id="34" w:name="_Toc3220"/>
       <w:r>
         <w:t>表3.3 比較之語言模型</w:t>
       </w:r>
@@ -8872,7 +8893,7 @@
       <w:pPr>
         <w:pStyle w:val="4"/>
       </w:pPr>
-      <w:bookmarkStart w:id="35" w:name="_Toc7846"/>
+      <w:bookmarkStart w:id="35" w:name="_Toc9369"/>
       <w:r>
         <w:t>3.6.2 結構化輸出與回應時間的量測</w:t>
       </w:r>
@@ -8952,7 +8973,7 @@
           <w:bCs/>
           <w:color w:val="1F4E9A"/>
         </w:rPr>
-        <w:t>三個模型由不同組員分別執行，但皆使用相同的程式、正確答案檔（labels_oir_total.csv）、提示詞與測試題，因此分類表現可以直接比較。回應時間則受顯示卡等硬體影響，必須在同一台設備上量測才能比較；若無法在同一設備執行，結果表將註明各模型的執行設備，且不比較其回應時間。</w:t>
+        <w:t>三個模型由不同組員分別執行，但皆使用相同的程式、正確答案檔（labels_oir_total_ori.csv）、提示詞與測試題，因此分類表現可以直接比較。回應時間則受顯示卡等硬體影響，必須在同一台設備上量測才能比較；若無法在同一設備執行，結果表將註明各模型的執行設備，且不比較其回應時間。</w:t>
       </w:r>
     </w:p>
     <w:p>
@@ -8962,14 +8983,25 @@
         <w:jc w:val="both"/>
       </w:pPr>
       <w:r>
-        <w:t>實作過程中我們也發現兩個值得注意的設計問題：若被取代文件欄位設為可省略，模型常回答 UPDATE 卻不指出是哪一份；若範例中的理由只是「This is UPDATE.」這類空泛文字，模型便會停止推理而直接複製類別。因此最終設計將該欄位設為必填，且只使用標註者寫有具體理由的練習題作為範例。完整的系統提示詞列於附錄 C。</w:t>
+        <w:t>實作過程中我們也發現兩個值得注意的設計問題：若被取代文件欄位設為可省略，模型常回答 UPDATE 卻不指出是哪一份；若範例中的理由只是「This is UPDATE.」這類空泛文字，模型便會停止推理而直接複製類別。因此最終設計將該欄位設為必填，且只使用標註者寫有具體理由的練習題作為範例。</w:t>
+      </w:r>
+      <w:r>
+        <w:rPr>
+          <w:b/>
+          <w:bCs/>
+          <w:color w:val="1F4E9A"/>
+        </w:rPr>
+        <w:t>系統提示詞亦依第 2 版標註規則補上徵才、結果公告、第二次甄選與志工招募等情況，並維持與原本相近的長度。我們曾嘗試在提示詞中逐條列出完整的規則與範例，但 Phi-4-mini 反而更常回答 UPDATE，且在理由中照抄規則裡的範例（例如並不存在的年度），顯示過長的規則清單不適合此規模的模型，因此未採用。</w:t>
+      </w:r>
+      <w:r>
+        <w:t>完整的系統提示詞列於附錄 C。</w:t>
       </w:r>
     </w:p>
     <w:p>
       <w:pPr>
         <w:pStyle w:val="3"/>
       </w:pPr>
-      <w:bookmarkStart w:id="36" w:name="_Toc22658"/>
+      <w:bookmarkStart w:id="36" w:name="_Toc9128"/>
       <w:r>
         <w:t>3.7 知識庫更新機制</w:t>
       </w:r>
@@ -8990,7 +9022,7 @@
         <w:pStyle w:val="25"/>
         <w:keepNext/>
       </w:pPr>
-      <w:bookmarkStart w:id="37" w:name="_Toc4606"/>
+      <w:bookmarkStart w:id="37" w:name="_Toc3674"/>
       <w:r>
         <w:t>表3.4 知識庫更新動作</w:t>
       </w:r>
@@ -9534,7 +9566,7 @@
       <w:pPr>
         <w:pStyle w:val="24"/>
       </w:pPr>
-      <w:bookmarkStart w:id="38" w:name="_Toc26227"/>
+      <w:bookmarkStart w:id="38" w:name="_Toc4759"/>
       <w:r>
         <w:t>圖3.3 文件檢查工具輸出範例</w:t>
       </w:r>
@@ -9544,7 +9576,7 @@
       <w:pPr>
         <w:pStyle w:val="3"/>
       </w:pPr>
-      <w:bookmarkStart w:id="39" w:name="_Toc20402"/>
+      <w:bookmarkStart w:id="39" w:name="_Toc14290"/>
       <w:r>
         <w:t>3.8 標註工具</w:t>
       </w:r>
@@ -9611,7 +9643,7 @@
       <w:pPr>
         <w:pStyle w:val="24"/>
       </w:pPr>
-      <w:bookmarkStart w:id="40" w:name="_Toc19710"/>
+      <w:bookmarkStart w:id="40" w:name="_Toc20229"/>
       <w:r>
         <w:t>圖3.4 標註工具畫面</w:t>
       </w:r>
@@ -9621,7 +9653,7 @@
       <w:pPr>
         <w:pStyle w:val="3"/>
       </w:pPr>
-      <w:bookmarkStart w:id="41" w:name="_Toc18379"/>
+      <w:bookmarkStart w:id="41" w:name="_Toc20738"/>
       <w:r>
         <w:t>3.9 跨語言測試設計</w:t>
       </w:r>
@@ -9715,7 +9747,7 @@
         <w:pStyle w:val="2"/>
         <w:pageBreakBefore/>
       </w:pPr>
-      <w:bookmarkStart w:id="42" w:name="_Toc8883"/>
+      <w:bookmarkStart w:id="42" w:name="_Toc10076"/>
       <w:r>
         <w:t>第四章 實證分析</w:t>
       </w:r>
@@ -9725,7 +9757,7 @@
       <w:pPr>
         <w:pStyle w:val="3"/>
       </w:pPr>
-      <w:bookmarkStart w:id="43" w:name="_Toc29649"/>
+      <w:bookmarkStart w:id="43" w:name="_Toc5561"/>
       <w:r>
         <w:t>4.1 實驗設計</w:t>
       </w:r>
@@ -9735,7 +9767,7 @@
       <w:pPr>
         <w:pStyle w:val="4"/>
       </w:pPr>
-      <w:bookmarkStart w:id="44" w:name="_Toc6315"/>
+      <w:bookmarkStart w:id="44" w:name="_Toc12495"/>
       <w:r>
         <w:t>4.1.1 測試案例的建立</w:t>
       </w:r>
@@ -9756,7 +9788,7 @@
         <w:pStyle w:val="25"/>
         <w:keepNext/>
       </w:pPr>
-      <w:bookmarkStart w:id="45" w:name="_Toc16654"/>
+      <w:bookmarkStart w:id="45" w:name="_Toc32170"/>
       <w:r>
         <w:t>表4.1 測試案例抽樣池</w:t>
       </w:r>
@@ -10411,7 +10443,7 @@
       <w:pPr>
         <w:pStyle w:val="4"/>
       </w:pPr>
-      <w:bookmarkStart w:id="46" w:name="_Toc26733"/>
+      <w:bookmarkStart w:id="46" w:name="_Toc15801"/>
       <w:r>
         <w:t>4.1.2 輸入檔案</w:t>
       </w:r>
@@ -10431,7 +10463,7 @@
       <w:pPr>
         <w:pStyle w:val="4"/>
       </w:pPr>
-      <w:bookmarkStart w:id="47" w:name="_Toc26980"/>
+      <w:bookmarkStart w:id="47" w:name="_Toc2668"/>
       <w:r>
         <w:t>4.1.3 標註與資料分割</w:t>
       </w:r>
@@ -10452,21 +10484,25 @@
           <w:bCs/>
           <w:color w:val="1F4E9A"/>
         </w:rPr>
-        <w:t>同一甄選的第二次甄選屬 UPDATE；不同學期別（秋季與春季）、招募、獲獎或錄取名單、任何結果公告（即使沒有名單）、計畫的不同階段，以及系列活動中的不同講次皆屬 NEW</w:t>
-      </w:r>
-      <w:r>
-        <w:t>；同一週期的中英文版本屬 REDUNDANT。</w:t>
-      </w:r>
+        <w:t>同一甄選的第二次甄選、同一甄選的下一階段，以及每學期重複舉辦的國際學生接待志工招募（含面談時間）屬 UPDATE；徵才公告與所有錄取名單、獲獎名單及甄選結果（包含第二次甄選的結果）屬 NEW；</w:t>
+      </w:r>
+      <w:r>
+        <w:t>講座系列中的不同講次屬 NEW；同一週期的中英文版本屬 REDUNDANT。完整規則摘要列於附錄 A。</w:t>
+      </w:r>
+    </w:p>
+    <w:p>
+      <w:pPr>
+        <w:spacing w:before="0" w:after="0" w:line="360" w:lineRule="auto"/>
+        <w:ind w:firstLine="480"/>
+        <w:jc w:val="both"/>
+      </w:pPr>
       <w:r>
         <w:rPr>
           <w:b/>
           <w:bCs/>
           <w:color w:val="1F4E9A"/>
         </w:rPr>
-        <w:t>當多條規則同時適用時（例如「第二次甄選結果」），結果、名單、招募、階段與學期別的 NEW 規則優先，唯延長或更正截止日期仍屬 UPDATE。</w:t>
-      </w:r>
-      <w:r>
-        <w:t>完整規則摘要列於附錄 A。</w:t>
+        <w:t>標註流程分為四個步驟。第一，由語言模型產生草稿，包含類別、被取代公告與一句理由。第二，三位組員各自檢查並修正草稿；三人之間的 Cohen's κ [23] 為 0.90 至 0.94，但因三人皆以同一份草稿為起點，此一致性會被高估，因此不作為標註一致性的證據。第三，三位組員逐題討論全部 200 題，對每一題決定共同的答案，建立 labels_oir_total_ori.csv。第四，將討論中形成的判斷整理為第 2 版標註規則，補上原規則未涵蓋的情況（徵才、志工招募、第二次甄選的結果、同一甄選的不同階段、學期別）。我們也曾嘗試一套更嚴格的規則（招募、階段與不同學期別一律屬 NEW），但它與「學生是否會依過期資訊行動」的核心定義不符，例如上一學期的志工招募公告在新公告發布後確實已經過期，因此未採用。最終 200 題中有 3 題標記為「不確定」。由於草稿來自語言模型，而受測方法亦為語言模型，標註結果可能偏向模型的判斷方式，此點列為研究限制。</w:t>
       </w:r>
     </w:p>
     <w:p>
@@ -10476,21 +10512,6 @@
         <w:jc w:val="both"/>
       </w:pPr>
       <w:r>
-        <w:rPr>
-          <w:b/>
-          <w:bCs/>
-          <w:color w:val="1F4E9A"/>
-        </w:rPr>
-        <w:t>標註流程分為四個步驟。第一，由語言模型產生草稿，包含類別、被取代公告與一句理由。第二，三位組員各自檢查並修正草稿；三人之間的 Cohen's κ [23] 為 0.90 至 0.94，但因三人皆以同一份草稿為起點，此一致性會被高估，因此不作為標註一致性的證據。第三，三位組員逐題討論全部 200 題，對每一題決定共同的答案，建立 labels_oir_total.csv。第四，討論中發現原規則未涵蓋的情況（學期別、招募、階段等），因此將標註規則修訂為第 2 版，並依新規則重新檢查全部 200 題，修正其中 18 題：14 題由 UPDATE 改為 NEW，2 題移除不同學期別的被取代公告，2 題更新理由。最終 200 題中有 3 題標記為「不確定」。由於草稿來自語言模型，而受測方法亦為語言模型，標註結果可能偏向模型的判斷方式，此點列為研究限制。</w:t>
-      </w:r>
-    </w:p>
-    <w:p>
-      <w:pPr>
-        <w:spacing w:before="0" w:after="0" w:line="360" w:lineRule="auto"/>
-        <w:ind w:firstLine="480"/>
-        <w:jc w:val="both"/>
-      </w:pPr>
-      <w:r>
         <w:t>200 題依類別分層，以固定亂數種子分為練習集（80 題）與測試集（120 題），各類別分布如表 4.2。所有門檻與範例皆只在練習集上決定，所有報告的數據皆來自測試集。</w:t>
       </w:r>
     </w:p>
@@ -10499,7 +10520,7 @@
         <w:pStyle w:val="25"/>
         <w:keepNext/>
       </w:pPr>
-      <w:bookmarkStart w:id="48" w:name="_Toc31129"/>
+      <w:bookmarkStart w:id="48" w:name="_Toc25666"/>
       <w:r>
         <w:t>表4.2 資料分割之類別分布</w:t>
       </w:r>
@@ -10814,7 +10835,7 @@
                 <w:sz w:val="21"/>
                 <w:szCs w:val="21"/>
               </w:rPr>
-              <w:t>46</w:t>
+              <w:t>52</w:t>
             </w:r>
           </w:p>
         </w:tc>
@@ -10849,7 +10870,7 @@
                 <w:sz w:val="21"/>
                 <w:szCs w:val="21"/>
               </w:rPr>
-              <w:t>32</w:t>
+              <w:t>26</w:t>
             </w:r>
           </w:p>
         </w:tc>
@@ -11002,7 +11023,7 @@
                 <w:sz w:val="21"/>
                 <w:szCs w:val="21"/>
               </w:rPr>
-              <w:t>69</w:t>
+              <w:t>77</w:t>
             </w:r>
           </w:p>
         </w:tc>
@@ -11037,7 +11058,7 @@
                 <w:sz w:val="21"/>
                 <w:szCs w:val="21"/>
               </w:rPr>
-              <w:t>48</w:t>
+              <w:t>40</w:t>
             </w:r>
           </w:p>
         </w:tc>
@@ -11193,7 +11214,7 @@
                 <w:sz w:val="21"/>
                 <w:szCs w:val="21"/>
               </w:rPr>
-              <w:t>115</w:t>
+              <w:t>129</w:t>
             </w:r>
           </w:p>
         </w:tc>
@@ -11228,7 +11249,7 @@
                 <w:sz w:val="21"/>
                 <w:szCs w:val="21"/>
               </w:rPr>
-              <w:t>80</w:t>
+              <w:t>66</w:t>
             </w:r>
           </w:p>
         </w:tc>
@@ -11321,14 +11342,14 @@
           <w:bCs/>
           <w:color w:val="1F4E9A"/>
         </w:rPr>
-        <w:t>38 題的輸入為真實附件，82 題為 .md 檔。</w:t>
+        <w:t>37 題的輸入為真實附件，83 題為 .md 檔。</w:t>
       </w:r>
     </w:p>
     <w:p>
       <w:pPr>
         <w:pStyle w:val="3"/>
       </w:pPr>
-      <w:bookmarkStart w:id="49" w:name="_Toc21560"/>
+      <w:bookmarkStart w:id="49" w:name="_Toc24627"/>
       <w:r>
         <w:t>4.2 評估指標</w:t>
       </w:r>
@@ -11391,7 +11412,7 @@
           <w:bCs/>
           <w:color w:val="1F4E9A"/>
         </w:rPr>
-        <w:t>約 58%</w:t>
+        <w:t>約 64%</w:t>
       </w:r>
       <w:r>
         <w:t xml:space="preserve"> 的類別正確率，macro-F1 能避免忽略少數類別的方法得到虛高的分數。</w:t>
@@ -11609,7 +11630,7 @@
       <w:pPr>
         <w:pStyle w:val="3"/>
       </w:pPr>
-      <w:bookmarkStart w:id="50" w:name="_Toc20290"/>
+      <w:bookmarkStart w:id="50" w:name="_Toc10410"/>
       <w:r>
         <w:t>4.3 規則方法與語言模型之結果</w:t>
       </w:r>
@@ -11627,7 +11648,7 @@
           <w:bCs/>
           <w:color w:val="1F4E9A"/>
         </w:rPr>
-        <w:t>v2 的結果以舊的正確答案計算；正確答案更新後，舊數據已不適用，因此本節暫時移除。三個模型皆以 labels_oir_total.csv 執行完成後，將依下列表格補上各方法的結果；語言模型方法（M1 至 M4）將分別列出三個模型的數據。</w:t>
+        <w:t>v2 的結果以舊的正確答案計算；正確答案更新後，舊數據已不適用，因此本節暫時移除。三個模型皆以 labels_oir_total_ori.csv 執行完成後，將依下列表格補上各方法的結果；語言模型方法（M1 至 M4）將分別列出三個模型的數據。</w:t>
       </w:r>
     </w:p>
     <w:p>
@@ -11635,7 +11656,7 @@
         <w:pStyle w:val="25"/>
         <w:keepNext/>
       </w:pPr>
-      <w:bookmarkStart w:id="51" w:name="_Toc7606"/>
+      <w:bookmarkStart w:id="51" w:name="_Toc7052"/>
       <w:r>
         <w:t>表4.3 各方法之正確率（測試集 120 題）</w:t>
       </w:r>
@@ -13839,7 +13860,7 @@
         <w:pStyle w:val="25"/>
         <w:keepNext/>
       </w:pPr>
-      <w:bookmarkStart w:id="52" w:name="_Toc11090"/>
+      <w:bookmarkStart w:id="52" w:name="_Toc23149"/>
       <w:r>
         <w:t>表4.4 各方法之 macro-F1 與成本（測試集）</w:t>
       </w:r>
@@ -15728,7 +15749,7 @@
       <w:pPr>
         <w:pStyle w:val="4"/>
       </w:pPr>
-      <w:bookmarkStart w:id="53" w:name="_Toc23944"/>
+      <w:bookmarkStart w:id="53" w:name="_Toc14732"/>
       <w:r>
         <w:t>4.3.1 統計檢定</w:t>
       </w:r>
@@ -15757,7 +15778,7 @@
         <w:pStyle w:val="25"/>
         <w:keepNext/>
       </w:pPr>
-      <w:bookmarkStart w:id="54" w:name="_Toc11028"/>
+      <w:bookmarkStart w:id="54" w:name="_Toc15808"/>
       <w:r>
         <w:t>表4.5 語言模型與比較基準之 McNemar 檢定</w:t>
       </w:r>
@@ -15801,6 +15822,12 @@
             <w:insideH w:val="single" w:color="auto" w:sz="4" w:space="0"/>
             <w:insideV w:val="single" w:color="auto" w:sz="4" w:space="0"/>
           </w:tblBorders>
+          <w:tblCellMar>
+            <w:top w:w="0" w:type="dxa"/>
+            <w:left w:w="108" w:type="dxa"/>
+            <w:bottom w:w="0" w:type="dxa"/>
+            <w:right w:w="108" w:type="dxa"/>
+          </w:tblCellMar>
         </w:tblPrEx>
         <w:trPr>
           <w:tblHeader/>
@@ -16720,7 +16747,7 @@
       <w:pPr>
         <w:pStyle w:val="3"/>
       </w:pPr>
-      <w:bookmarkStart w:id="55" w:name="_Toc24246"/>
+      <w:bookmarkStart w:id="55" w:name="_Toc12549"/>
       <w:r>
         <w:t>4.4 三個語言模型之比較（RQ1、RQ2）</w:t>
       </w:r>
@@ -16749,7 +16776,7 @@
         <w:pStyle w:val="25"/>
         <w:keepNext/>
       </w:pPr>
-      <w:bookmarkStart w:id="56" w:name="_Toc11960"/>
+      <w:bookmarkStart w:id="56" w:name="_Toc2385"/>
       <w:r>
         <w:t>表4.6 三個語言模型之比較（M2 設定，測試集 120 題）</w:t>
       </w:r>
@@ -18622,7 +18649,7 @@
       <w:pPr>
         <w:pStyle w:val="3"/>
       </w:pPr>
-      <w:bookmarkStart w:id="57" w:name="_Toc6295"/>
+      <w:bookmarkStart w:id="57" w:name="_Toc20843"/>
       <w:r>
         <w:t>4.5 錯誤分析</w:t>
       </w:r>
@@ -18640,14 +18667,14 @@
           <w:bCs/>
           <w:color w:val="1F4E9A"/>
         </w:rPr>
-        <w:t>本節將把每個方法的錯誤依類型分解為誤判為更新、漏判更新、被取代公告錯誤與其他四類，並以混淆矩陣比較規則方法與語言模型，結果待補。由於第 2 版標註規則將招募、結果公告與不同學期別的公告定為 NEW，「誤判為更新」（實為 NEW 卻判為 UPDATE）將是分析的重點之一。</w:t>
+        <w:t>本節將把每個方法的錯誤依類型分解為誤判為更新、漏判更新、被取代公告錯誤與其他四類，並以混淆矩陣比較規則方法與語言模型，結果待補。分析重點為「誤判為更新」（實為 NEW 卻判為 UPDATE，例如結果公告與使用相同範本的不同計畫）與「漏判更新」（例如新年度版本被判為新計畫），以及兩者在三個模型之間的差異。</w:t>
       </w:r>
     </w:p>
     <w:p>
       <w:pPr>
         <w:pStyle w:val="3"/>
       </w:pPr>
-      <w:bookmarkStart w:id="58" w:name="_Toc11875"/>
+      <w:bookmarkStart w:id="58" w:name="_Toc3127"/>
       <w:r>
         <w:t>4.6 輸入檔案類型的影響</w:t>
       </w:r>
@@ -18665,7 +18692,7 @@
           <w:bCs/>
           <w:color w:val="1F4E9A"/>
         </w:rPr>
-        <w:t>本節將比較各方法在真實附件（38 題）與 .md 檔（82 題）上的 macro-F1，結果待補。</w:t>
+        <w:t>本節將比較各方法在真實附件（37 題）與 .md 檔（83 題）上的 macro-F1，結果待補。</w:t>
       </w:r>
       <w:r>
         <w:t>附件的檔名常是「活動海報」、「活動簡章｜Program_Info」等通用名稱，使標題訊號失去作用；部分公告唯一可讀的附件是海報或場次表，內容與公告本身差異很大。</w:t>
@@ -18683,7 +18710,7 @@
       <w:pPr>
         <w:pStyle w:val="3"/>
       </w:pPr>
-      <w:bookmarkStart w:id="59" w:name="_Toc28579"/>
+      <w:bookmarkStart w:id="59" w:name="_Toc13965"/>
       <w:r>
         <w:t>4.7 跨語言情境之結果（RQ3）</w:t>
       </w:r>
@@ -18704,7 +18731,7 @@
         <w:pStyle w:val="25"/>
         <w:keepNext/>
       </w:pPr>
-      <w:bookmarkStart w:id="60" w:name="_Toc25855"/>
+      <w:bookmarkStart w:id="60" w:name="_Toc1450"/>
       <w:r>
         <w:t>表4.7 同語言與跨語言情境之完全正確率（M2 設定）</w:t>
       </w:r>
@@ -19491,7 +19518,7 @@
       <w:pPr>
         <w:pStyle w:val="3"/>
       </w:pPr>
-      <w:bookmarkStart w:id="61" w:name="_Toc32039"/>
+      <w:bookmarkStart w:id="61" w:name="_Toc23366"/>
       <w:r>
         <w:t>4.8 討論</w:t>
       </w:r>
@@ -19517,7 +19544,7 @@
         <w:pStyle w:val="2"/>
         <w:pageBreakBefore/>
       </w:pPr>
-      <w:bookmarkStart w:id="62" w:name="_Toc5443"/>
+      <w:bookmarkStart w:id="62" w:name="_Toc9754"/>
       <w:r>
         <w:t>第五章 結論</w:t>
       </w:r>
@@ -19527,7 +19554,7 @@
       <w:pPr>
         <w:pStyle w:val="3"/>
       </w:pPr>
-      <w:bookmarkStart w:id="63" w:name="_Toc11685"/>
+      <w:bookmarkStart w:id="63" w:name="_Toc28179"/>
       <w:r>
         <w:t>5.1 結論</w:t>
       </w:r>
@@ -19641,7 +19668,7 @@
       <w:pPr>
         <w:pStyle w:val="3"/>
       </w:pPr>
-      <w:bookmarkStart w:id="64" w:name="_Toc6736"/>
+      <w:bookmarkStart w:id="64" w:name="_Toc25209"/>
       <w:r>
         <w:t>5.2 研究成果與貢獻</w:t>
       </w:r>
@@ -19707,7 +19734,7 @@
       <w:pPr>
         <w:pStyle w:val="3"/>
       </w:pPr>
-      <w:bookmarkStart w:id="65" w:name="_Toc27406"/>
+      <w:bookmarkStart w:id="65" w:name="_Toc3915"/>
       <w:r>
         <w:t>5.3 研究限制</w:t>
       </w:r>
@@ -19789,7 +19816,7 @@
           <w:b/>
           <w:bCs/>
         </w:rPr>
-        <w:t>標註規則於標註期間修訂。</w:t>
+        <w:t>標註規則來自同一批資料。</w:t>
       </w:r>
       <w:r>
         <w:t xml:space="preserve"> </w:t>
@@ -19800,7 +19827,7 @@
           <w:bCs/>
           <w:color w:val="1F4E9A"/>
         </w:rPr>
-        <w:t>第 2 版規則是在討論 200 題的過程中訂定的，雖已依新規則重新檢查全部題目，但規則本身是根據這批資料調整的，用於其他資料時可能需要再修訂。</w:t>
+        <w:t>第 2 版規則是依三位組員對這 200 題的討論結果整理而成，用於其他資料時可能需要再修訂；系統提示詞的規則亦來自同一份規則。</w:t>
       </w:r>
     </w:p>
     <w:p>
@@ -19899,7 +19926,7 @@
       <w:pPr>
         <w:pStyle w:val="3"/>
       </w:pPr>
-      <w:bookmarkStart w:id="66" w:name="_Toc19463"/>
+      <w:bookmarkStart w:id="66" w:name="_Toc24059"/>
       <w:r>
         <w:t>5.4 後續研究方向</w:t>
       </w:r>
@@ -20036,7 +20063,7 @@
         <w:pStyle w:val="2"/>
         <w:pageBreakBefore/>
       </w:pPr>
-      <w:bookmarkStart w:id="67" w:name="_Toc10548"/>
+      <w:bookmarkStart w:id="67" w:name="_Toc22756"/>
       <w:r>
         <w:t>參考文獻</w:t>
       </w:r>
@@ -20477,7 +20504,7 @@
         <w:pStyle w:val="2"/>
         <w:pageBreakBefore/>
       </w:pPr>
-      <w:bookmarkStart w:id="68" w:name="_Toc25683"/>
+      <w:bookmarkStart w:id="68" w:name="_Toc16359"/>
       <w:r>
         <w:t>附錄</w:t>
       </w:r>
@@ -20487,7 +20514,7 @@
       <w:pPr>
         <w:pStyle w:val="3"/>
       </w:pPr>
-      <w:bookmarkStart w:id="69" w:name="_Toc557"/>
+      <w:bookmarkStart w:id="69" w:name="_Toc7574"/>
       <w:r>
         <w:t>附錄 A 標註規則摘要</w:t>
       </w:r>
@@ -20498,7 +20525,7 @@
         <w:pStyle w:val="25"/>
         <w:keepNext/>
       </w:pPr>
-      <w:bookmarkStart w:id="70" w:name="_Toc24772"/>
+      <w:bookmarkStart w:id="70" w:name="_Toc29806"/>
       <w:r>
         <w:t>表A.1 邊界情況之標註規則</w:t>
       </w:r>
@@ -20670,24 +20697,7 @@
                 <w:sz w:val="21"/>
                 <w:szCs w:val="21"/>
               </w:rPr>
-              <w:t>同一計畫、</w:t>
-            </w:r>
-            <w:r>
-              <w:rPr>
-                <w:b/>
-                <w:bCs/>
-                <w:color w:val="1F4E9A"/>
-                <w:sz w:val="21"/>
-                <w:szCs w:val="21"/>
-              </w:rPr>
-              <w:t>同一學期別</w:t>
-            </w:r>
-            <w:r>
-              <w:rPr>
-                <w:sz w:val="21"/>
-                <w:szCs w:val="21"/>
-              </w:rPr>
-              <w:t>的新年度版本（即使只有年份不同）</w:t>
+              <w:t>同一計畫的新年度版本（即使只有年份不同）</w:t>
             </w:r>
           </w:p>
         </w:tc>
@@ -20859,7 +20869,7 @@
                 <w:sz w:val="21"/>
                 <w:szCs w:val="21"/>
               </w:rPr>
-              <w:t>同一甄選的第二次</w:t>
+              <w:t>同一甄選的第二次甄選</w:t>
             </w:r>
             <w:r>
               <w:rPr>
@@ -20869,14 +20879,7 @@
                 <w:sz w:val="21"/>
                 <w:szCs w:val="21"/>
               </w:rPr>
-              <w:t>或之後的</w:t>
-            </w:r>
-            <w:r>
-              <w:rPr>
-                <w:sz w:val="21"/>
-                <w:szCs w:val="21"/>
-              </w:rPr>
-              <w:t>甄選（「第二次甄選」、「補甄選」）</w:t>
+              <w:t>或其口試順序</w:t>
             </w:r>
           </w:p>
         </w:tc>
@@ -20965,7 +20968,7 @@
                 <w:sz w:val="21"/>
                 <w:szCs w:val="21"/>
               </w:rPr>
-              <w:t>同類獎勵於不同頁面或不同場次、梯次再次公告</w:t>
+              <w:t>同一甄選的下一階段，或下一年度的同一階段</w:t>
             </w:r>
           </w:p>
         </w:tc>
@@ -21054,7 +21057,7 @@
                 <w:sz w:val="21"/>
                 <w:szCs w:val="21"/>
               </w:rPr>
-              <w:t>例行說明會、面試時間表的下一期</w:t>
+              <w:t>例行說明會、</w:t>
             </w:r>
             <w:r>
               <w:rPr>
@@ -21064,7 +21067,31 @@
                 <w:sz w:val="21"/>
                 <w:szCs w:val="21"/>
               </w:rPr>
-              <w:t>（招募除外）</w:t>
+              <w:t>分享會、</w:t>
+            </w:r>
+            <w:r>
+              <w:rPr>
+                <w:sz w:val="21"/>
+                <w:szCs w:val="21"/>
+              </w:rPr>
+              <w:t>面試時間表</w:t>
+            </w:r>
+            <w:r>
+              <w:rPr>
+                <w:b/>
+                <w:bCs/>
+                <w:color w:val="1F4E9A"/>
+                <w:sz w:val="21"/>
+                <w:szCs w:val="21"/>
+              </w:rPr>
+              <w:t>或選填學校場次表</w:t>
+            </w:r>
+            <w:r>
+              <w:rPr>
+                <w:sz w:val="21"/>
+                <w:szCs w:val="21"/>
+              </w:rPr>
+              <w:t>的下一期</w:t>
             </w:r>
           </w:p>
         </w:tc>
@@ -21147,10 +21174,13 @@
             </w:pPr>
             <w:r>
               <w:rPr>
-                <w:sz w:val="21"/>
-                <w:szCs w:val="21"/>
-              </w:rPr>
-              <w:t>同一計畫但標題改寫（如「全球」改為「境外」）</w:t>
+                <w:b/>
+                <w:bCs/>
+                <w:color w:val="1F4E9A"/>
+                <w:sz w:val="21"/>
+                <w:szCs w:val="21"/>
+              </w:rPr>
+              <w:t>每學期重複舉辦的國際學生接待志工招募（含面談時間與錄取名單）</w:t>
             </w:r>
           </w:p>
         </w:tc>
@@ -21179,10 +21209,13 @@
             </w:pPr>
             <w:r>
               <w:rPr>
-                <w:sz w:val="21"/>
-                <w:szCs w:val="21"/>
-              </w:rPr>
-              <w:t>UPDATE（標記 reworded）</w:t>
+                <w:b/>
+                <w:bCs/>
+                <w:color w:val="1F4E9A"/>
+                <w:sz w:val="21"/>
+                <w:szCs w:val="21"/>
+              </w:rPr>
+              <w:t>UPDATE</w:t>
             </w:r>
           </w:p>
         </w:tc>
@@ -21236,7 +21269,7 @@
                 <w:sz w:val="21"/>
                 <w:szCs w:val="21"/>
               </w:rPr>
-              <w:t>使用相同範本的不同獎學金或學校</w:t>
+              <w:t>同一計畫但標題改寫（如「全球」改為「境外」）</w:t>
             </w:r>
           </w:p>
         </w:tc>
@@ -21268,7 +21301,7 @@
                 <w:sz w:val="21"/>
                 <w:szCs w:val="21"/>
               </w:rPr>
-              <w:t>NEW（標記 template_trap）</w:t>
+              <w:t>UPDATE（標記 reworded）</w:t>
             </w:r>
           </w:p>
         </w:tc>
@@ -21319,13 +21352,20 @@
             </w:pPr>
             <w:r>
               <w:rPr>
+                <w:sz w:val="21"/>
+                <w:szCs w:val="21"/>
+              </w:rPr>
+              <w:t>使用相同範本的不同獎學金或學校</w:t>
+            </w:r>
+            <w:r>
+              <w:rPr>
                 <w:b/>
                 <w:bCs/>
                 <w:color w:val="1F4E9A"/>
                 <w:sz w:val="21"/>
                 <w:szCs w:val="21"/>
               </w:rPr>
-              <w:t>不同學期別：秋季與春季、第一與第二學期、上與下學期</w:t>
+              <w:t>（如華語營志工與接待志工）</w:t>
             </w:r>
           </w:p>
         </w:tc>
@@ -21354,13 +21394,10 @@
             </w:pPr>
             <w:r>
               <w:rPr>
-                <w:b/>
-                <w:bCs/>
-                <w:color w:val="1F4E9A"/>
-                <w:sz w:val="21"/>
-                <w:szCs w:val="21"/>
-              </w:rPr>
-              <w:t>NEW</w:t>
+                <w:sz w:val="21"/>
+                <w:szCs w:val="21"/>
+              </w:rPr>
+              <w:t>NEW（標記 template_trap）</w:t>
             </w:r>
           </w:p>
         </w:tc>
@@ -21416,6 +21453,16 @@
               </w:rPr>
               <w:t>錄取名單、放榜、獲獎名單</w:t>
             </w:r>
+            <w:r>
+              <w:rPr>
+                <w:b/>
+                <w:bCs/>
+                <w:color w:val="1F4E9A"/>
+                <w:sz w:val="21"/>
+                <w:szCs w:val="21"/>
+              </w:rPr>
+              <w:t>、甄選結果（含第二次甄選的結果）</w:t>
+            </w:r>
           </w:p>
         </w:tc>
         <w:tc>
@@ -21503,7 +21550,7 @@
                 <w:sz w:val="21"/>
                 <w:szCs w:val="21"/>
               </w:rPr>
-              <w:t>任何結果公告，即使沒有名單（含第二次甄選的結果）</w:t>
+              <w:t>徵才公告（「徵才」、「誠徵」、「約聘人員」）</w:t>
             </w:r>
           </w:p>
         </w:tc>
@@ -21589,13 +21636,10 @@
             </w:pPr>
             <w:r>
               <w:rPr>
-                <w:b/>
-                <w:bCs/>
-                <w:color w:val="1F4E9A"/>
-                <w:sz w:val="21"/>
-                <w:szCs w:val="21"/>
-              </w:rPr>
-              <w:t>招募（「招募」、「徵才」、「誠徵」），含志工招募與其面談時間</w:t>
+                <w:sz w:val="21"/>
+                <w:szCs w:val="21"/>
+              </w:rPr>
+              <w:t>系列講座中的不同講次</w:t>
             </w:r>
           </w:p>
         </w:tc>
@@ -21624,9 +21668,6 @@
             </w:pPr>
             <w:r>
               <w:rPr>
-                <w:b/>
-                <w:bCs/>
-                <w:color w:val="1F4E9A"/>
                 <w:sz w:val="21"/>
                 <w:szCs w:val="21"/>
               </w:rPr>
@@ -21681,13 +21722,10 @@
             </w:pPr>
             <w:r>
               <w:rPr>
-                <w:b/>
-                <w:bCs/>
-                <w:color w:val="1F4E9A"/>
-                <w:sz w:val="21"/>
-                <w:szCs w:val="21"/>
-              </w:rPr>
-              <w:t>計畫的不同階段（「第二階段」、「第三階段」）</w:t>
+                <w:sz w:val="21"/>
+                <w:szCs w:val="21"/>
+              </w:rPr>
+              <w:t>同一週期的重新張貼或中英文版本</w:t>
             </w:r>
           </w:p>
         </w:tc>
@@ -21716,13 +21754,10 @@
             </w:pPr>
             <w:r>
               <w:rPr>
-                <w:b/>
-                <w:bCs/>
-                <w:color w:val="1F4E9A"/>
-                <w:sz w:val="21"/>
-                <w:szCs w:val="21"/>
-              </w:rPr>
-              <w:t>NEW</w:t>
+                <w:sz w:val="21"/>
+                <w:szCs w:val="21"/>
+              </w:rPr>
+              <w:t>REDUNDANT</w:t>
             </w:r>
           </w:p>
         </w:tc>
@@ -21776,24 +21811,7 @@
                 <w:sz w:val="21"/>
                 <w:szCs w:val="21"/>
               </w:rPr>
-              <w:t>系列講座</w:t>
-            </w:r>
-            <w:r>
-              <w:rPr>
-                <w:b/>
-                <w:bCs/>
-                <w:color w:val="1F4E9A"/>
-                <w:sz w:val="21"/>
-                <w:szCs w:val="21"/>
-              </w:rPr>
-              <w:t>或活動</w:t>
-            </w:r>
-            <w:r>
-              <w:rPr>
-                <w:sz w:val="21"/>
-                <w:szCs w:val="21"/>
-              </w:rPr>
-              <w:t>中的不同講次</w:t>
+              <w:t>內文為空但標題與週期和舊公告相同</w:t>
             </w:r>
           </w:p>
         </w:tc>
@@ -21825,7 +21843,7 @@
                 <w:sz w:val="21"/>
                 <w:szCs w:val="21"/>
               </w:rPr>
-              <w:t>NEW</w:t>
+              <w:t>REDUNDANT（標記 unsure）</w:t>
             </w:r>
           </w:p>
         </w:tc>
@@ -21870,16 +21888,19 @@
           </w:tcPr>
           <w:p>
             <w:pPr>
-              <w:keepNext/>
+              <w:keepNext w:val="0"/>
               <w:spacing w:line="276" w:lineRule="auto"/>
               <w:jc w:val="left"/>
             </w:pPr>
             <w:r>
               <w:rPr>
-                <w:sz w:val="21"/>
-                <w:szCs w:val="21"/>
-              </w:rPr>
-              <w:t>同一週期的重新張貼或中英文版本</w:t>
+                <w:b/>
+                <w:bCs/>
+                <w:color w:val="1F4E9A"/>
+                <w:sz w:val="21"/>
+                <w:szCs w:val="21"/>
+              </w:rPr>
+              <w:t>多份舊文件都符合時</w:t>
             </w:r>
           </w:p>
         </w:tc>
@@ -21902,102 +21923,19 @@
           </w:tcPr>
           <w:p>
             <w:pPr>
-              <w:keepNext/>
+              <w:keepNext w:val="0"/>
               <w:spacing w:line="276" w:lineRule="auto"/>
               <w:jc w:val="left"/>
             </w:pPr>
             <w:r>
               <w:rPr>
-                <w:sz w:val="21"/>
-                <w:szCs w:val="21"/>
-              </w:rPr>
-              <w:t>REDUNDANT</w:t>
-            </w:r>
-          </w:p>
-        </w:tc>
-      </w:tr>
-      <w:tr>
-        <w:tblPrEx>
-          <w:tblBorders>
-            <w:top w:val="single" w:color="auto" w:sz="4" w:space="0"/>
-            <w:left w:val="single" w:color="auto" w:sz="4" w:space="0"/>
-            <w:bottom w:val="single" w:color="auto" w:sz="4" w:space="0"/>
-            <w:right w:val="single" w:color="auto" w:sz="4" w:space="0"/>
-            <w:insideH w:val="single" w:color="auto" w:sz="4" w:space="0"/>
-            <w:insideV w:val="single" w:color="auto" w:sz="4" w:space="0"/>
-          </w:tblBorders>
-          <w:tblCellMar>
-            <w:top w:w="0" w:type="dxa"/>
-            <w:left w:w="108" w:type="dxa"/>
-            <w:bottom w:w="0" w:type="dxa"/>
-            <w:right w:w="108" w:type="dxa"/>
-          </w:tblCellMar>
-        </w:tblPrEx>
-        <w:trPr>
-          <w:cantSplit/>
-          <w:jc w:val="center"/>
-        </w:trPr>
-        <w:tc>
-          <w:tcPr>
-            <w:tcW w:w="6026" w:type="dxa"/>
-            <w:tcBorders>
-              <w:top w:val="single" w:color="808080" w:sz="4" w:space="0"/>
-              <w:left w:val="single" w:color="808080" w:sz="4" w:space="0"/>
-              <w:bottom w:val="single" w:color="808080" w:sz="4" w:space="0"/>
-              <w:right w:val="single" w:color="808080" w:sz="4" w:space="0"/>
-            </w:tcBorders>
-            <w:tcMar>
-              <w:top w:w="50" w:type="dxa"/>
-              <w:left w:w="90" w:type="dxa"/>
-              <w:bottom w:w="50" w:type="dxa"/>
-              <w:right w:w="90" w:type="dxa"/>
-            </w:tcMar>
-            <w:vAlign w:val="center"/>
-          </w:tcPr>
-          <w:p>
-            <w:pPr>
-              <w:keepNext w:val="0"/>
-              <w:spacing w:line="276" w:lineRule="auto"/>
-              <w:jc w:val="left"/>
-            </w:pPr>
-            <w:r>
-              <w:rPr>
-                <w:sz w:val="21"/>
-                <w:szCs w:val="21"/>
-              </w:rPr>
-              <w:t>內文為空但標題與週期和舊公告相同</w:t>
-            </w:r>
-          </w:p>
-        </w:tc>
-        <w:tc>
-          <w:tcPr>
-            <w:tcW w:w="3000" w:type="dxa"/>
-            <w:tcBorders>
-              <w:top w:val="single" w:color="808080" w:sz="4" w:space="0"/>
-              <w:left w:val="single" w:color="808080" w:sz="4" w:space="0"/>
-              <w:bottom w:val="single" w:color="808080" w:sz="4" w:space="0"/>
-              <w:right w:val="single" w:color="808080" w:sz="4" w:space="0"/>
-            </w:tcBorders>
-            <w:tcMar>
-              <w:top w:w="50" w:type="dxa"/>
-              <w:left w:w="90" w:type="dxa"/>
-              <w:bottom w:w="50" w:type="dxa"/>
-              <w:right w:w="90" w:type="dxa"/>
-            </w:tcMar>
-            <w:vAlign w:val="center"/>
-          </w:tcPr>
-          <w:p>
-            <w:pPr>
-              <w:keepNext w:val="0"/>
-              <w:spacing w:line="276" w:lineRule="auto"/>
-              <w:jc w:val="left"/>
-            </w:pPr>
-            <w:r>
-              <w:rPr>
-                <w:sz w:val="21"/>
-                <w:szCs w:val="21"/>
-              </w:rPr>
-              <w:t>REDUNDANT（標記 unsure）</w:t>
+                <w:b/>
+                <w:bCs/>
+                <w:color w:val="1F4E9A"/>
+                <w:sz w:val="21"/>
+                <w:szCs w:val="21"/>
+              </w:rPr>
+              <w:t>取最新一份，並優先選擇同一學期別</w:t>
             </w:r>
           </w:p>
         </w:tc>
@@ -22010,24 +21948,9 @@
     </w:p>
     <w:p>
       <w:pPr>
-        <w:spacing w:before="0" w:after="0" w:line="360" w:lineRule="auto"/>
-        <w:ind w:firstLine="0"/>
-        <w:jc w:val="both"/>
-      </w:pPr>
-      <w:r>
-        <w:rPr>
-          <w:b/>
-          <w:bCs/>
-          <w:color w:val="1F4E9A"/>
-        </w:rPr>
-        <w:t>規則衝突時，結果、名單、招募、階段與學期別的 NEW 規則優先；唯延長或更正截止日期仍屬 UPDATE。</w:t>
-      </w:r>
-    </w:p>
-    <w:p>
-      <w:pPr>
         <w:pStyle w:val="3"/>
       </w:pPr>
-      <w:bookmarkStart w:id="71" w:name="_Toc9576"/>
+      <w:bookmarkStart w:id="71" w:name="_Toc16022"/>
       <w:r>
         <w:t>附錄 B 系統使用說明</w:t>
       </w:r>
@@ -22175,7 +22098,7 @@
           <w:sz w:val="18"/>
           <w:szCs w:val="18"/>
         </w:rPr>
-        <w:t>.venv/Scripts/python experiment/run.py experiment/data/labels_oir_total.csv --model phi4-mini</w:t>
+        <w:t>.venv/Scripts/python experiment/run.py experiment/data/labels_oir_total_ori.csv --model phi4-mini</w:t>
       </w:r>
     </w:p>
     <w:p>
@@ -22257,7 +22180,7 @@
       <w:pPr>
         <w:pStyle w:val="3"/>
       </w:pPr>
-      <w:bookmarkStart w:id="72" w:name="_Toc17934"/>
+      <w:bookmarkStart w:id="72" w:name="_Toc5858"/>
       <w:r>
         <w:t>附錄 C 語言模型之系統提示詞</w:t>
       </w:r>
@@ -22377,10 +22300,67 @@
       <w:r>
         <w:rPr>
           <w:rFonts w:ascii="Consolas" w:hAnsi="Consolas" w:eastAsia="標楷體" w:cs="Consolas"/>
+          <w:b/>
+          <w:bCs/>
+          <w:color w:val="1F4E9A"/>
           <w:sz w:val="16"/>
           <w:szCs w:val="16"/>
         </w:rPr>
-        <w:t xml:space="preserve">            A deadline extension or correction notice is an UPDATE.</w:t>
+        <w:t xml:space="preserve">            A deadline extension or correction notice (延長, 更正) is an UPDATE. So is a</w:t>
+      </w:r>
+    </w:p>
+    <w:p>
+      <w:pPr>
+        <w:shd w:val="clear" w:color="auto" w:fill="F3F1EC"/>
+        <w:spacing w:before="0" w:after="0" w:line="260" w:lineRule="auto"/>
+        <w:ind w:left="200" w:right="200"/>
+      </w:pPr>
+      <w:r>
+        <w:rPr>
+          <w:rFonts w:ascii="Consolas" w:hAnsi="Consolas" w:eastAsia="標楷體" w:cs="Consolas"/>
+          <w:b/>
+          <w:bCs/>
+          <w:color w:val="1F4E9A"/>
+          <w:sz w:val="16"/>
+          <w:szCs w:val="16"/>
+        </w:rPr>
+        <w:t xml:space="preserve">            second selection round (第二次甄選), the next stage of the same selection, and the</w:t>
+      </w:r>
+    </w:p>
+    <w:p>
+      <w:pPr>
+        <w:shd w:val="clear" w:color="auto" w:fill="F3F1EC"/>
+        <w:spacing w:before="0" w:after="0" w:line="260" w:lineRule="auto"/>
+        <w:ind w:left="200" w:right="200"/>
+      </w:pPr>
+      <w:r>
+        <w:rPr>
+          <w:rFonts w:ascii="Consolas" w:hAnsi="Consolas" w:eastAsia="標楷體" w:cs="Consolas"/>
+          <w:b/>
+          <w:bCs/>
+          <w:color w:val="1F4E9A"/>
+          <w:sz w:val="16"/>
+          <w:szCs w:val="16"/>
+        </w:rPr>
+        <w:t xml:space="preserve">            next edition of a recurring info session, sharing session, interview schedule or</w:t>
+      </w:r>
+    </w:p>
+    <w:p>
+      <w:pPr>
+        <w:shd w:val="clear" w:color="auto" w:fill="F3F1EC"/>
+        <w:spacing w:before="0" w:after="0" w:line="260" w:lineRule="auto"/>
+        <w:ind w:left="200" w:right="200"/>
+      </w:pPr>
+      <w:r>
+        <w:rPr>
+          <w:rFonts w:ascii="Consolas" w:hAnsi="Consolas" w:eastAsia="標楷體" w:cs="Consolas"/>
+          <w:b/>
+          <w:bCs/>
+          <w:color w:val="1F4E9A"/>
+          <w:sz w:val="16"/>
+          <w:szCs w:val="16"/>
+        </w:rPr>
+        <w:t xml:space="preserve">            volunteer recruitment.</w:t>
       </w:r>
     </w:p>
     <w:p>
@@ -22422,10 +22402,31 @@
       <w:r>
         <w:rPr>
           <w:rFonts w:ascii="Consolas" w:hAnsi="Consolas" w:eastAsia="標楷體" w:cs="Consolas"/>
+          <w:b/>
+          <w:bCs/>
+          <w:color w:val="1F4E9A"/>
           <w:sz w:val="16"/>
           <w:szCs w:val="16"/>
         </w:rPr>
-        <w:t xml:space="preserve">            Result lists and info sessions are NEW.</w:t>
+        <w:t xml:space="preserve">            Result and name lists (錄取名單, 獲獎名單, 甄選結果, 放榜), job postings (徵才)</w:t>
+      </w:r>
+    </w:p>
+    <w:p>
+      <w:pPr>
+        <w:shd w:val="clear" w:color="auto" w:fill="F3F1EC"/>
+        <w:spacing w:before="0" w:after="0" w:line="260" w:lineRule="auto"/>
+        <w:ind w:left="200" w:right="200"/>
+      </w:pPr>
+      <w:r>
+        <w:rPr>
+          <w:rFonts w:ascii="Consolas" w:hAnsi="Consolas" w:eastAsia="標楷體" w:cs="Consolas"/>
+          <w:b/>
+          <w:bCs/>
+          <w:color w:val="1F4E9A"/>
+          <w:sz w:val="16"/>
+          <w:szCs w:val="16"/>
+        </w:rPr>
+        <w:t xml:space="preserve">            and numbered lectures in a series (系列) are NEW.</w:t>
       </w:r>
     </w:p>
     <w:p>
@@ -22485,7 +22486,25 @@
           <w:sz w:val="16"/>
           <w:szCs w:val="16"/>
         </w:rPr>
-        <w:t>If several candidates are editions of the same program, the target is the most recent one.</w:t>
+        <w:t>If several candidates are editions of the same program, the target is the most recent one,</w:t>
+      </w:r>
+    </w:p>
+    <w:p>
+      <w:pPr>
+        <w:shd w:val="clear" w:color="auto" w:fill="F3F1EC"/>
+        <w:spacing w:before="0" w:after="0" w:line="260" w:lineRule="auto"/>
+        <w:ind w:left="200" w:right="200"/>
+      </w:pPr>
+      <w:r>
+        <w:rPr>
+          <w:rFonts w:ascii="Consolas" w:hAnsi="Consolas" w:eastAsia="標楷體" w:cs="Consolas"/>
+          <w:b/>
+          <w:bCs/>
+          <w:color w:val="1F4E9A"/>
+          <w:sz w:val="16"/>
+          <w:szCs w:val="16"/>
+        </w:rPr>
+        <w:t>preferring the same term (fall or spring) as the new announcement.</w:t>
       </w:r>
     </w:p>
     <w:p>
@@ -22674,13 +22693,13 @@
 <file path=word/numbering.xml><?xml version="1.0" encoding="utf-8"?>
 <w:numbering xmlns:wpc="http://schemas.microsoft.com/office/word/2010/wordprocessingCanvas" xmlns:mc="http://schemas.openxmlformats.org/markup-compatibility/2006" xmlns:o="urn:schemas-microsoft-com:office:office" xmlns:r="http://schemas.openxmlformats.org/officeDocument/2006/relationships" xmlns:m="http://schemas.openxmlformats.org/officeDocument/2006/math" xmlns:v="urn:schemas-microsoft-com:vml" xmlns:wp14="http://schemas.microsoft.com/office/word/2010/wordprocessingDrawing" xmlns:wp="http://schemas.openxmlformats.org/drawingml/2006/wordprocessingDrawing" xmlns:w10="urn:schemas-microsoft-com:office:word" xmlns:w="http://schemas.openxmlformats.org/wordprocessingml/2006/main" xmlns:w14="http://schemas.microsoft.com/office/word/2010/wordml" xmlns:wpg="http://schemas.microsoft.com/office/word/2010/wordprocessingGroup" xmlns:wpi="http://schemas.microsoft.com/office/word/2010/wordprocessingInk" xmlns:wne="http://schemas.microsoft.com/office/word/2006/wordml" xmlns:wps="http://schemas.microsoft.com/office/word/2010/wordprocessingShape" xmlns:wpsCustomData="http://www.wps.cn/officeDocument/2013/wpsCustomData" mc:Ignorable="w14 wp14">
   <w:abstractNum w:abstractNumId="0">
-    <w:nsid w:val="CCB3477A"/>
+    <w:nsid w:val="96845B91"/>
     <w:multiLevelType w:val="singleLevel"/>
-    <w:tmpl w:val="CCB3477A"/>
+    <w:tmpl w:val="96845B91"/>
     <w:lvl w:ilvl="0" w:tentative="0">
       <w:start w:val="1"/>
-      <w:numFmt w:val="bullet"/>
-      <w:lvlText w:val="•"/>
+      <w:numFmt w:val="decimal"/>
+      <w:lvlText w:val="%1."/>
       <w:lvlJc w:val="left"/>
       <w:pPr>
         <w:ind w:left="720" w:hanging="360"/>
@@ -22688,6 +22707,34 @@
     </w:lvl>
   </w:abstractNum>
   <w:abstractNum w:abstractNumId="1">
+    <w:nsid w:val="ECDAB7A2"/>
+    <w:multiLevelType w:val="singleLevel"/>
+    <w:tmpl w:val="ECDAB7A2"/>
+    <w:lvl w:ilvl="0" w:tentative="0">
+      <w:start w:val="1"/>
+      <w:numFmt w:val="decimal"/>
+      <w:lvlText w:val="%1."/>
+      <w:lvlJc w:val="left"/>
+      <w:pPr>
+        <w:ind w:left="720" w:hanging="360"/>
+      </w:pPr>
+    </w:lvl>
+  </w:abstractNum>
+  <w:abstractNum w:abstractNumId="2">
+    <w:nsid w:val="002BBE98"/>
+    <w:multiLevelType w:val="singleLevel"/>
+    <w:tmpl w:val="002BBE98"/>
+    <w:lvl w:ilvl="0" w:tentative="0">
+      <w:start w:val="1"/>
+      <w:numFmt w:val="decimal"/>
+      <w:lvlText w:val="%1."/>
+      <w:lvlJc w:val="left"/>
+      <w:pPr>
+        <w:ind w:left="720" w:hanging="360"/>
+      </w:pPr>
+    </w:lvl>
+  </w:abstractNum>
+  <w:abstractNum w:abstractNumId="3">
     <w:nsid w:val="0053208E"/>
     <w:multiLevelType w:val="singleLevel"/>
     <w:tmpl w:val="0053208E"/>
@@ -22701,42 +22748,14 @@
       </w:pPr>
     </w:lvl>
   </w:abstractNum>
-  <w:abstractNum w:abstractNumId="2">
-    <w:nsid w:val="0D116C97"/>
+  <w:abstractNum w:abstractNumId="4">
+    <w:nsid w:val="304DC5D6"/>
     <w:multiLevelType w:val="singleLevel"/>
-    <w:tmpl w:val="0D116C97"/>
+    <w:tmpl w:val="304DC5D6"/>
     <w:lvl w:ilvl="0" w:tentative="0">
       <w:start w:val="1"/>
-      <w:numFmt w:val="decimal"/>
-      <w:lvlText w:val="%1."/>
-      <w:lvlJc w:val="left"/>
-      <w:pPr>
-        <w:ind w:left="720" w:hanging="360"/>
-      </w:pPr>
-    </w:lvl>
-  </w:abstractNum>
-  <w:abstractNum w:abstractNumId="3">
-    <w:nsid w:val="5B493961"/>
-    <w:multiLevelType w:val="singleLevel"/>
-    <w:tmpl w:val="5B493961"/>
-    <w:lvl w:ilvl="0" w:tentative="0">
-      <w:start w:val="1"/>
-      <w:numFmt w:val="decimal"/>
-      <w:lvlText w:val="%1."/>
-      <w:lvlJc w:val="left"/>
-      <w:pPr>
-        <w:ind w:left="720" w:hanging="360"/>
-      </w:pPr>
-    </w:lvl>
-  </w:abstractNum>
-  <w:abstractNum w:abstractNumId="4">
-    <w:nsid w:val="7509C2ED"/>
-    <w:multiLevelType w:val="singleLevel"/>
-    <w:tmpl w:val="7509C2ED"/>
-    <w:lvl w:ilvl="0" w:tentative="0">
-      <w:start w:val="1"/>
-      <w:numFmt w:val="decimal"/>
-      <w:lvlText w:val="%1."/>
+      <w:numFmt w:val="bullet"/>
+      <w:lvlText w:val="•"/>
       <w:lvlJc w:val="left"/>
       <w:pPr>
         <w:ind w:left="720" w:hanging="360"/>
@@ -22744,31 +22763,31 @@
     </w:lvl>
   </w:abstractNum>
   <w:num w:numId="1">
+    <w:abstractNumId w:val="3"/>
+    <w:lvlOverride w:ilvl="0">
+      <w:startOverride w:val="1"/>
+    </w:lvlOverride>
+  </w:num>
+  <w:num w:numId="2">
+    <w:abstractNumId w:val="2"/>
+    <w:lvlOverride w:ilvl="0">
+      <w:startOverride w:val="1"/>
+    </w:lvlOverride>
+  </w:num>
+  <w:num w:numId="3">
+    <w:abstractNumId w:val="4"/>
+    <w:lvlOverride w:ilvl="0">
+      <w:startOverride w:val="1"/>
+    </w:lvlOverride>
+  </w:num>
+  <w:num w:numId="4">
     <w:abstractNumId w:val="1"/>
     <w:lvlOverride w:ilvl="0">
       <w:startOverride w:val="1"/>
     </w:lvlOverride>
   </w:num>
-  <w:num w:numId="2">
-    <w:abstractNumId w:val="4"/>
-    <w:lvlOverride w:ilvl="0">
-      <w:startOverride w:val="1"/>
-    </w:lvlOverride>
-  </w:num>
-  <w:num w:numId="3">
+  <w:num w:numId="5">
     <w:abstractNumId w:val="0"/>
-    <w:lvlOverride w:ilvl="0">
-      <w:startOverride w:val="1"/>
-    </w:lvlOverride>
-  </w:num>
-  <w:num w:numId="4">
-    <w:abstractNumId w:val="2"/>
-    <w:lvlOverride w:ilvl="0">
-      <w:startOverride w:val="1"/>
-    </w:lvlOverride>
-  </w:num>
-  <w:num w:numId="5">
-    <w:abstractNumId w:val="3"/>
     <w:lvlOverride w:ilvl="0">
       <w:startOverride w:val="1"/>
     </w:lvlOverride>
@@ -22852,7 +22871,7 @@
     <w:lsdException w:qFormat="1" w:unhideWhenUsed="0" w:uiPriority="0" w:semiHidden="0" w:name="Title"/>
     <w:lsdException w:unhideWhenUsed="0" w:uiPriority="0" w:semiHidden="0" w:name="Closing"/>
     <w:lsdException w:unhideWhenUsed="0" w:uiPriority="0" w:semiHidden="0" w:name="Signature"/>
-    <w:lsdException w:qFormat="1" w:unhideWhenUsed="0" w:uiPriority="0" w:name="Default Paragraph Font"/>
+    <w:lsdException w:unhideWhenUsed="0" w:uiPriority="0" w:name="Default Paragraph Font"/>
     <w:lsdException w:unhideWhenUsed="0" w:uiPriority="0" w:semiHidden="0" w:name="Body Text"/>
     <w:lsdException w:unhideWhenUsed="0" w:uiPriority="0" w:semiHidden="0" w:name="Body Text Indent"/>
     <w:lsdException w:unhideWhenUsed="0" w:uiPriority="0" w:semiHidden="0" w:name="List Continue"/>
@@ -23142,7 +23161,6 @@
   <w:style w:type="character" w:default="1" w:styleId="8">
     <w:name w:val="Default Paragraph Font"/>
     <w:semiHidden/>
-    <w:qFormat/>
     <w:uiPriority w:val="0"/>
   </w:style>
   <w:style w:type="table" w:default="1" w:styleId="9">
@@ -23267,7 +23285,6 @@
     <w:link w:val="13"/>
     <w:semiHidden/>
     <w:unhideWhenUsed/>
-    <w:qFormat/>
     <w:uiPriority w:val="99"/>
     <w:rPr>
       <w:sz w:val="20"/>
@@ -23279,7 +23296,6 @@
     <w:link w:val="11"/>
     <w:semiHidden/>
     <w:unhideWhenUsed/>
-    <w:qFormat/>
     <w:uiPriority w:val="99"/>
     <w:rPr>
       <w:sz w:val="20"/>
@@ -23308,7 +23324,6 @@
     <w:name w:val="TOC Title"/>
     <w:basedOn w:val="1"/>
     <w:next w:val="1"/>
-    <w:qFormat/>
     <w:uiPriority w:val="0"/>
     <w:pPr>
       <w:spacing w:before="0" w:after="360" w:line="360" w:lineRule="auto"/>

</xml_diff>